<commit_message>
updated word version to where it should've been already... too many versions
</commit_message>
<xml_diff>
--- a/Resume.docx
+++ b/Resume.docx
@@ -207,25 +207,7 @@
                 <w:sz w:val="22"/>
                 <w:szCs w:val="22"/>
               </w:rPr>
-              <w:t xml:space="preserve">197 </w:t>
-            </w:r>
-            <w:proofErr w:type="spellStart"/>
-            <w:r>
-              <w:rPr>
-                <w:b w:val="0"/>
-                <w:sz w:val="22"/>
-                <w:szCs w:val="22"/>
-              </w:rPr>
-              <w:t>Zouave</w:t>
-            </w:r>
-            <w:proofErr w:type="spellEnd"/>
-            <w:r>
-              <w:rPr>
-                <w:b w:val="0"/>
-                <w:sz w:val="22"/>
-                <w:szCs w:val="22"/>
-              </w:rPr>
-              <w:t xml:space="preserve"> Street</w:t>
+              <w:t>197 Zouave Street</w:t>
             </w:r>
           </w:p>
         </w:tc>
@@ -600,25 +582,7 @@
           <w:szCs w:val="22"/>
           <w:lang w:val="en-US"/>
         </w:rPr>
-        <w:t xml:space="preserve">tions, a </w:t>
-      </w:r>
-      <w:proofErr w:type="spellStart"/>
-      <w:r>
-        <w:rPr>
-          <w:sz w:val="22"/>
-          <w:szCs w:val="22"/>
-          <w:lang w:val="en-US"/>
-        </w:rPr>
-        <w:t>Sudoku</w:t>
-      </w:r>
-      <w:proofErr w:type="spellEnd"/>
-      <w:r>
-        <w:rPr>
-          <w:sz w:val="22"/>
-          <w:szCs w:val="22"/>
-          <w:lang w:val="en-US"/>
-        </w:rPr>
-        <w:t xml:space="preserve"> game, and an in-progress chess engine</w:t>
+        <w:t>tions, a Sudoku game, and an in-progress chess engine</w:t>
       </w:r>
       <w:bookmarkStart w:id="1" w:name="OLE_LINK4"/>
     </w:p>
@@ -659,43 +623,7 @@
           <w:szCs w:val="22"/>
           <w:lang w:val="en-US"/>
         </w:rPr>
-        <w:t xml:space="preserve">Participate in projects on </w:t>
-      </w:r>
-      <w:proofErr w:type="spellStart"/>
-      <w:r>
-        <w:rPr>
-          <w:sz w:val="22"/>
-          <w:szCs w:val="22"/>
-          <w:lang w:val="en-US"/>
-        </w:rPr>
-        <w:t>GitHub</w:t>
-      </w:r>
-      <w:proofErr w:type="spellEnd"/>
-      <w:r>
-        <w:rPr>
-          <w:sz w:val="22"/>
-          <w:szCs w:val="22"/>
-          <w:lang w:val="en-US"/>
-        </w:rPr>
-        <w:t xml:space="preserve">, </w:t>
-      </w:r>
-      <w:proofErr w:type="spellStart"/>
-      <w:r>
-        <w:rPr>
-          <w:sz w:val="22"/>
-          <w:szCs w:val="22"/>
-          <w:lang w:val="en-US"/>
-        </w:rPr>
-        <w:t>SourceForge</w:t>
-      </w:r>
-      <w:proofErr w:type="spellEnd"/>
-      <w:r>
-        <w:rPr>
-          <w:sz w:val="22"/>
-          <w:szCs w:val="22"/>
-          <w:lang w:val="en-US"/>
-        </w:rPr>
-        <w:t>, and Google Code</w:t>
+        <w:t>Participate in projects on GitHub, SourceForge, and Google Code</w:t>
       </w:r>
     </w:p>
     <w:p>
@@ -781,7 +709,6 @@
           <w:szCs w:val="22"/>
         </w:rPr>
       </w:pPr>
-      <w:proofErr w:type="spellStart"/>
       <w:r>
         <w:rPr>
           <w:rFonts w:cs="Helvetica"/>
@@ -791,9 +718,8 @@
           <w:szCs w:val="21"/>
           <w:lang w:val="en-US"/>
         </w:rPr>
-        <w:t>BlackBerry</w:t>
-      </w:r>
-      <w:proofErr w:type="spellEnd"/>
+        <w:t>Ga</w:t>
+      </w:r>
       <w:r>
         <w:rPr>
           <w:rFonts w:cs="Helvetica"/>
@@ -803,11 +729,22 @@
           <w:szCs w:val="21"/>
           <w:lang w:val="en-US"/>
         </w:rPr>
-        <w:t xml:space="preserve"> Internet Service Software Developer</w:t>
-      </w:r>
-      <w:r>
-        <w:rPr>
+        <w:t>me Portability Developer –</w:t>
+      </w:r>
+      <w:r>
+        <w:rPr>
+          <w:rFonts w:cs="Helvetica"/>
           <w:b/>
+          <w:color w:val="000000"/>
+          <w:sz w:val="22"/>
+          <w:szCs w:val="21"/>
+          <w:lang w:val="en-US"/>
+        </w:rPr>
+        <w:t xml:space="preserve"> Core R&amp;D</w:t>
+      </w:r>
+      <w:r>
+        <w:rPr>
+          <w:b/>
           <w:sz w:val="22"/>
           <w:szCs w:val="22"/>
         </w:rPr>
@@ -817,22 +754,24 @@
         <w:rPr>
           <w:sz w:val="22"/>
           <w:szCs w:val="22"/>
-        </w:rPr>
-        <w:t xml:space="preserve">Research In Motion Limited, Waterloo, Ontario, </w:t>
-      </w:r>
-      <w:r>
-        <w:rPr>
-          <w:sz w:val="22"/>
-          <w:szCs w:val="22"/>
-        </w:rPr>
-        <w:t>May</w:t>
-      </w:r>
-      <w:r>
-        <w:rPr>
-          <w:sz w:val="22"/>
-          <w:szCs w:val="22"/>
-        </w:rPr>
-        <w:t xml:space="preserve"> – August 2010</w:t>
+          <w:lang w:val="en-US"/>
+        </w:rPr>
+        <w:t>TransGaming T</w:t>
+      </w:r>
+      <w:r>
+        <w:rPr>
+          <w:sz w:val="22"/>
+          <w:szCs w:val="22"/>
+          <w:lang w:val="en-US"/>
+        </w:rPr>
+        <w:t>echnologies Inc</w:t>
+      </w:r>
+      <w:r>
+        <w:rPr>
+          <w:sz w:val="22"/>
+          <w:szCs w:val="22"/>
+        </w:rPr>
+        <w:t>, Toronto, Ontario, January – April 2011</w:t>
       </w:r>
     </w:p>
     <w:p>
@@ -862,26 +801,18 @@
           <w:rFonts w:ascii="Times" w:hAnsi="Times"/>
           <w:sz w:val="22"/>
           <w:szCs w:val="22"/>
-        </w:rPr>
-        <w:t xml:space="preserve">Wrote and maintained </w:t>
-      </w:r>
-      <w:proofErr w:type="spellStart"/>
+          <w:lang w:val="en-US"/>
+        </w:rPr>
+        <w:t>Developed strict ANSI C peer-reviewed co</w:t>
+      </w:r>
       <w:r>
         <w:rPr>
           <w:rFonts w:ascii="Times" w:hAnsi="Times"/>
           <w:sz w:val="22"/>
           <w:szCs w:val="22"/>
-        </w:rPr>
-        <w:t>BlackBerry</w:t>
-      </w:r>
-      <w:proofErr w:type="spellEnd"/>
-      <w:r>
-        <w:rPr>
-          <w:rFonts w:ascii="Times" w:hAnsi="Times"/>
-          <w:sz w:val="22"/>
-          <w:szCs w:val="22"/>
-        </w:rPr>
-        <w:t xml:space="preserve"> Internet Service tools in C++</w:t>
+          <w:lang w:val="en-US"/>
+        </w:rPr>
+        <w:t>de, and reviewed others’ code</w:t>
       </w:r>
     </w:p>
     <w:p>
@@ -901,11 +832,20 @@
       <w:r>
         <w:rPr>
           <w:rFonts w:ascii="Times" w:hAnsi="Times"/>
-          <w:sz w:val="20"/>
-          <w:szCs w:val="20"/>
-          <w:lang w:val="en-US"/>
-        </w:rPr>
-        <w:t>Developed networking tools using ACE library</w:t>
+          <w:sz w:val="22"/>
+          <w:szCs w:val="22"/>
+          <w:lang w:val="en-US"/>
+        </w:rPr>
+        <w:t>Re-implemented DirectX API func</w:t>
+      </w:r>
+      <w:r>
+        <w:rPr>
+          <w:rFonts w:ascii="Times" w:hAnsi="Times"/>
+          <w:sz w:val="22"/>
+          <w:szCs w:val="22"/>
+          <w:lang w:val="en-US"/>
+        </w:rPr>
+        <w:t>tions for TransGaming’s WineX</w:t>
       </w:r>
     </w:p>
     <w:p>
@@ -927,8 +867,18 @@
           <w:rFonts w:ascii="Times" w:hAnsi="Times"/>
           <w:sz w:val="22"/>
           <w:szCs w:val="22"/>
-        </w:rPr>
-        <w:t>Worked extensively on unit testing framework in Python</w:t>
+          <w:lang w:val="en-US"/>
+        </w:rPr>
+        <w:t>Worked responsibly and independently o</w:t>
+      </w:r>
+      <w:r>
+        <w:rPr>
+          <w:rFonts w:ascii="Times" w:hAnsi="Times"/>
+          <w:sz w:val="22"/>
+          <w:szCs w:val="22"/>
+          <w:lang w:val="en-US"/>
+        </w:rPr>
+        <w:t>n both Linux and Windows code</w:t>
       </w:r>
     </w:p>
     <w:p>
@@ -947,36 +897,43 @@
       </w:pPr>
       <w:r>
         <w:rPr>
-          <w:sz w:val="22"/>
-          <w:szCs w:val="22"/>
-        </w:rPr>
-        <w:t>Developed modular, extensible, reusable code</w:t>
-      </w:r>
-    </w:p>
-    <w:p>
-      <w:pPr>
-        <w:rPr>
+          <w:rFonts w:ascii="Times" w:hAnsi="Times"/>
+          <w:sz w:val="22"/>
+          <w:szCs w:val="22"/>
+          <w:lang w:val="en-US"/>
+        </w:rPr>
+        <w:t>Implemented various 3D Mesh related functions and features</w:t>
+      </w:r>
+    </w:p>
+    <w:p>
+      <w:pPr>
+        <w:rPr>
+          <w:rFonts w:cs="Helvetica"/>
           <w:b/>
-          <w:sz w:val="22"/>
-          <w:szCs w:val="22"/>
-        </w:rPr>
-      </w:pPr>
-    </w:p>
-    <w:p>
-      <w:pPr>
-        <w:rPr>
-          <w:sz w:val="22"/>
-          <w:szCs w:val="22"/>
-        </w:rPr>
-      </w:pPr>
-      <w:proofErr w:type="spellStart"/>
-      <w:r>
-        <w:rPr>
+          <w:color w:val="000000"/>
+          <w:sz w:val="22"/>
+          <w:szCs w:val="21"/>
+          <w:lang w:val="en-US"/>
+        </w:rPr>
+      </w:pPr>
+    </w:p>
+    <w:p>
+      <w:pPr>
+        <w:rPr>
+          <w:sz w:val="22"/>
+          <w:szCs w:val="22"/>
+        </w:rPr>
+      </w:pPr>
+      <w:r>
+        <w:rPr>
+          <w:rFonts w:cs="Helvetica"/>
           <w:b/>
-          <w:sz w:val="22"/>
-          <w:szCs w:val="22"/>
-        </w:rPr>
-        <w:t>SlipS</w:t>
+          <w:color w:val="000000"/>
+          <w:sz w:val="22"/>
+          <w:szCs w:val="21"/>
+          <w:lang w:val="en-US"/>
+        </w:rPr>
+        <w:t>BlackBerry Internet Service Software Developer</w:t>
       </w:r>
       <w:r>
         <w:rPr>
@@ -984,74 +941,28 @@
           <w:sz w:val="22"/>
           <w:szCs w:val="22"/>
         </w:rPr>
-        <w:t>tream</w:t>
-      </w:r>
-      <w:proofErr w:type="spellEnd"/>
-      <w:r>
-        <w:rPr>
-          <w:b/>
-          <w:sz w:val="22"/>
-          <w:szCs w:val="22"/>
-        </w:rPr>
-        <w:t xml:space="preserve"> </w:t>
-      </w:r>
-      <w:r>
-        <w:rPr>
-          <w:b/>
-          <w:sz w:val="22"/>
-          <w:szCs w:val="22"/>
-        </w:rPr>
-        <w:t>Software Test</w:t>
-      </w:r>
-      <w:r>
-        <w:rPr>
-          <w:b/>
-          <w:sz w:val="22"/>
-          <w:szCs w:val="22"/>
-        </w:rPr>
-        <w:t xml:space="preserve">/Tools Developer, </w:t>
-      </w:r>
-      <w:r>
-        <w:rPr>
-          <w:sz w:val="22"/>
-          <w:szCs w:val="22"/>
-        </w:rPr>
-        <w:t>Research In Motion</w:t>
-      </w:r>
-      <w:r>
-        <w:rPr>
-          <w:sz w:val="22"/>
-          <w:szCs w:val="22"/>
-        </w:rPr>
-        <w:t xml:space="preserve"> Limited</w:t>
-      </w:r>
-      <w:r>
-        <w:rPr>
-          <w:sz w:val="22"/>
-          <w:szCs w:val="22"/>
-        </w:rPr>
-        <w:t>, W</w:t>
-      </w:r>
-      <w:r>
-        <w:rPr>
-          <w:sz w:val="22"/>
-          <w:szCs w:val="22"/>
-        </w:rPr>
-        <w:t>aterloo, Ontario, September</w:t>
-      </w:r>
-      <w:r>
-        <w:rPr>
-          <w:sz w:val="22"/>
-          <w:szCs w:val="22"/>
-        </w:rPr>
-        <w:t xml:space="preserve"> – </w:t>
-      </w:r>
-      <w:r>
-        <w:rPr>
-          <w:sz w:val="22"/>
-          <w:szCs w:val="22"/>
-        </w:rPr>
-        <w:t>December 2009</w:t>
+        <w:t xml:space="preserve">, </w:t>
+      </w:r>
+      <w:r>
+        <w:rPr>
+          <w:sz w:val="22"/>
+          <w:szCs w:val="22"/>
+        </w:rPr>
+        <w:t xml:space="preserve">Research In Motion Limited, Waterloo, Ontario, </w:t>
+      </w:r>
+      <w:r>
+        <w:rPr>
+          <w:sz w:val="22"/>
+          <w:szCs w:val="22"/>
+        </w:rPr>
+        <w:t>May</w:t>
+      </w:r>
+      <w:r>
+        <w:rPr>
+          <w:sz w:val="22"/>
+          <w:szCs w:val="22"/>
+        </w:rPr>
+        <w:t xml:space="preserve"> – August 2010</w:t>
       </w:r>
     </w:p>
     <w:p>
@@ -1082,41 +993,7 @@
           <w:sz w:val="22"/>
           <w:szCs w:val="22"/>
         </w:rPr>
-        <w:t>Perform</w:t>
-      </w:r>
-      <w:r>
-        <w:rPr>
-          <w:rFonts w:ascii="Times" w:hAnsi="Times"/>
-          <w:sz w:val="22"/>
-          <w:szCs w:val="22"/>
-        </w:rPr>
-        <w:t>ed</w:t>
-      </w:r>
-      <w:r>
-        <w:rPr>
-          <w:rFonts w:ascii="Times" w:hAnsi="Times"/>
-          <w:sz w:val="22"/>
-          <w:szCs w:val="22"/>
-        </w:rPr>
-        <w:t xml:space="preserve"> </w:t>
-      </w:r>
-      <w:proofErr w:type="spellStart"/>
-      <w:r>
-        <w:rPr>
-          <w:rFonts w:ascii="Times" w:hAnsi="Times"/>
-          <w:sz w:val="22"/>
-          <w:szCs w:val="22"/>
-        </w:rPr>
-        <w:t>BlackBerry</w:t>
-      </w:r>
-      <w:proofErr w:type="spellEnd"/>
-      <w:r>
-        <w:rPr>
-          <w:rFonts w:ascii="Times" w:hAnsi="Times"/>
-          <w:sz w:val="22"/>
-          <w:szCs w:val="22"/>
-        </w:rPr>
-        <w:t xml:space="preserve"> browser performance testing and profiling</w:t>
+        <w:t>Wrote and maintained BlackBerry Internet Service tools in C++</w:t>
       </w:r>
     </w:p>
     <w:p>
@@ -1136,42 +1013,11 @@
       <w:r>
         <w:rPr>
           <w:rFonts w:ascii="Times" w:hAnsi="Times"/>
-          <w:sz w:val="22"/>
-          <w:szCs w:val="22"/>
-        </w:rPr>
-        <w:t>Wrote and contributed to testing tools in</w:t>
-      </w:r>
-      <w:r>
-        <w:rPr>
-          <w:rFonts w:ascii="Times" w:hAnsi="Times"/>
-          <w:sz w:val="22"/>
-          <w:szCs w:val="22"/>
-        </w:rPr>
-        <w:t xml:space="preserve"> </w:t>
-      </w:r>
-      <w:r>
-        <w:rPr>
-          <w:rFonts w:ascii="Times" w:hAnsi="Times"/>
-          <w:sz w:val="22"/>
-          <w:szCs w:val="22"/>
-        </w:rPr>
-        <w:t xml:space="preserve">VBA and </w:t>
-      </w:r>
-      <w:r>
-        <w:rPr>
-          <w:rFonts w:ascii="Times" w:hAnsi="Times"/>
-          <w:sz w:val="22"/>
-          <w:szCs w:val="22"/>
-        </w:rPr>
-        <w:t>C++</w:t>
-      </w:r>
-      <w:r>
-        <w:rPr>
-          <w:rFonts w:ascii="Times" w:hAnsi="Times"/>
-          <w:sz w:val="22"/>
-          <w:szCs w:val="22"/>
-        </w:rPr>
-        <w:t>, and provided documentation for said tools</w:t>
+          <w:sz w:val="20"/>
+          <w:szCs w:val="20"/>
+          <w:lang w:val="en-US"/>
+        </w:rPr>
+        <w:t>Developed networking tools using ACE library</w:t>
       </w:r>
     </w:p>
     <w:p>
@@ -1194,140 +1040,8 @@
           <w:sz w:val="22"/>
           <w:szCs w:val="22"/>
         </w:rPr>
-        <w:t>Test</w:t>
-      </w:r>
-      <w:r>
-        <w:rPr>
-          <w:rFonts w:ascii="Times" w:hAnsi="Times"/>
-          <w:sz w:val="22"/>
-          <w:szCs w:val="22"/>
-        </w:rPr>
-        <w:t>ed</w:t>
-      </w:r>
-      <w:r>
-        <w:rPr>
-          <w:rFonts w:ascii="Times" w:hAnsi="Times"/>
-          <w:sz w:val="22"/>
-          <w:szCs w:val="22"/>
-        </w:rPr>
-        <w:t xml:space="preserve"> various </w:t>
-      </w:r>
-      <w:proofErr w:type="spellStart"/>
-      <w:r>
-        <w:rPr>
-          <w:rFonts w:ascii="Times" w:hAnsi="Times"/>
-          <w:sz w:val="22"/>
-          <w:szCs w:val="22"/>
-        </w:rPr>
-        <w:t>BlackBerry</w:t>
-      </w:r>
-      <w:proofErr w:type="spellEnd"/>
-      <w:r>
-        <w:rPr>
-          <w:rFonts w:ascii="Times" w:hAnsi="Times"/>
-          <w:sz w:val="22"/>
-          <w:szCs w:val="22"/>
-        </w:rPr>
-        <w:t xml:space="preserve"> software systems</w:t>
-      </w:r>
-      <w:r>
-        <w:rPr>
-          <w:sz w:val="22"/>
-          <w:szCs w:val="22"/>
-        </w:rPr>
-        <w:t xml:space="preserve"> </w:t>
-      </w:r>
-    </w:p>
-    <w:p>
-      <w:pPr>
-        <w:rPr>
-          <w:b/>
-          <w:sz w:val="22"/>
-          <w:szCs w:val="22"/>
-        </w:rPr>
-      </w:pPr>
-    </w:p>
-    <w:p>
-      <w:pPr>
-        <w:rPr>
-          <w:sz w:val="22"/>
-          <w:szCs w:val="22"/>
-        </w:rPr>
-      </w:pPr>
-      <w:r>
-        <w:rPr>
-          <w:b/>
-          <w:sz w:val="22"/>
-          <w:szCs w:val="22"/>
-        </w:rPr>
-        <w:t>Application Developer</w:t>
-      </w:r>
-      <w:r>
-        <w:rPr>
-          <w:b/>
-          <w:sz w:val="22"/>
-          <w:szCs w:val="22"/>
-        </w:rPr>
-        <w:t xml:space="preserve">, </w:t>
-      </w:r>
-      <w:r>
-        <w:rPr>
-          <w:bCs/>
-          <w:sz w:val="22"/>
-          <w:szCs w:val="22"/>
-        </w:rPr>
-        <w:t>Sun Life Financial</w:t>
-      </w:r>
-      <w:r>
-        <w:rPr>
-          <w:sz w:val="22"/>
-          <w:szCs w:val="22"/>
-        </w:rPr>
-        <w:t xml:space="preserve">, </w:t>
-      </w:r>
-      <w:r>
-        <w:rPr>
-          <w:sz w:val="22"/>
-          <w:szCs w:val="22"/>
-        </w:rPr>
-        <w:t>Waterloo</w:t>
-      </w:r>
-      <w:r>
-        <w:rPr>
-          <w:sz w:val="22"/>
-          <w:szCs w:val="22"/>
-        </w:rPr>
-        <w:t xml:space="preserve">, Ontario, </w:t>
-      </w:r>
-      <w:r>
-        <w:rPr>
-          <w:sz w:val="22"/>
-          <w:szCs w:val="22"/>
-        </w:rPr>
-        <w:t>January</w:t>
-      </w:r>
-      <w:r>
-        <w:rPr>
-          <w:sz w:val="22"/>
-          <w:szCs w:val="22"/>
-        </w:rPr>
-        <w:t xml:space="preserve"> – </w:t>
-      </w:r>
-      <w:r>
-        <w:rPr>
-          <w:sz w:val="22"/>
-          <w:szCs w:val="22"/>
-        </w:rPr>
-        <w:t>April 2009</w:t>
-      </w:r>
-    </w:p>
-    <w:p>
-      <w:pPr>
-        <w:rPr>
-          <w:sz w:val="22"/>
-          <w:szCs w:val="22"/>
-        </w:rPr>
-      </w:pPr>
+        <w:t>Worked extensively on unit testing framework in Python</w:t>
+      </w:r>
     </w:p>
     <w:p>
       <w:pPr>
@@ -1335,53 +1049,120 @@
           <w:ilvl w:val="0"/>
           <w:numId w:val="1"/>
         </w:numPr>
-        <w:rPr>
-          <w:sz w:val="22"/>
-          <w:szCs w:val="22"/>
-        </w:rPr>
-      </w:pPr>
-      <w:r>
-        <w:rPr>
-          <w:sz w:val="22"/>
-          <w:szCs w:val="22"/>
-        </w:rPr>
-        <w:t xml:space="preserve">Developed functionality for the company intranet portal using </w:t>
-      </w:r>
-      <w:r>
-        <w:rPr>
-          <w:sz w:val="22"/>
-          <w:szCs w:val="22"/>
-        </w:rPr>
-        <w:t>ASP</w:t>
-      </w:r>
-      <w:r>
-        <w:rPr>
-          <w:sz w:val="22"/>
-          <w:szCs w:val="22"/>
-        </w:rPr>
-        <w:t>.</w:t>
-      </w:r>
-      <w:r>
-        <w:rPr>
-          <w:sz w:val="22"/>
-          <w:szCs w:val="22"/>
-        </w:rPr>
-        <w:t>NET</w:t>
-      </w:r>
-      <w:r>
-        <w:rPr>
-          <w:sz w:val="22"/>
-          <w:szCs w:val="22"/>
-        </w:rPr>
-        <w:t>,</w:t>
-      </w:r>
-      <w:r>
-        <w:rPr>
-          <w:sz w:val="22"/>
-          <w:szCs w:val="22"/>
-        </w:rPr>
-        <w:t xml:space="preserve"> C# and Ajax</w:t>
-      </w:r>
+        <w:spacing w:beforeLines="1" w:afterLines="1"/>
+        <w:rPr>
+          <w:rFonts w:ascii="Times" w:hAnsi="Times"/>
+          <w:sz w:val="20"/>
+          <w:szCs w:val="20"/>
+          <w:lang w:val="en-US"/>
+        </w:rPr>
+      </w:pPr>
+      <w:r>
+        <w:rPr>
+          <w:sz w:val="22"/>
+          <w:szCs w:val="22"/>
+        </w:rPr>
+        <w:t>Developed modular, extensible, reusable code</w:t>
+      </w:r>
+    </w:p>
+    <w:p>
+      <w:pPr>
+        <w:rPr>
+          <w:b/>
+          <w:sz w:val="22"/>
+          <w:szCs w:val="22"/>
+        </w:rPr>
+      </w:pPr>
+    </w:p>
+    <w:p>
+      <w:pPr>
+        <w:rPr>
+          <w:sz w:val="22"/>
+          <w:szCs w:val="22"/>
+        </w:rPr>
+      </w:pPr>
+      <w:r>
+        <w:rPr>
+          <w:b/>
+          <w:sz w:val="22"/>
+          <w:szCs w:val="22"/>
+        </w:rPr>
+        <w:t>SlipS</w:t>
+      </w:r>
+      <w:r>
+        <w:rPr>
+          <w:b/>
+          <w:sz w:val="22"/>
+          <w:szCs w:val="22"/>
+        </w:rPr>
+        <w:t xml:space="preserve">tream </w:t>
+      </w:r>
+      <w:r>
+        <w:rPr>
+          <w:b/>
+          <w:sz w:val="22"/>
+          <w:szCs w:val="22"/>
+        </w:rPr>
+        <w:t>Software Test</w:t>
+      </w:r>
+      <w:r>
+        <w:rPr>
+          <w:b/>
+          <w:sz w:val="22"/>
+          <w:szCs w:val="22"/>
+        </w:rPr>
+        <w:t xml:space="preserve">/Tools Developer, </w:t>
+      </w:r>
+      <w:r>
+        <w:rPr>
+          <w:sz w:val="22"/>
+          <w:szCs w:val="22"/>
+        </w:rPr>
+        <w:t>Research In Motion</w:t>
+      </w:r>
+      <w:r>
+        <w:rPr>
+          <w:sz w:val="22"/>
+          <w:szCs w:val="22"/>
+        </w:rPr>
+        <w:t xml:space="preserve"> Limited</w:t>
+      </w:r>
+      <w:r>
+        <w:rPr>
+          <w:sz w:val="22"/>
+          <w:szCs w:val="22"/>
+        </w:rPr>
+        <w:t>, W</w:t>
+      </w:r>
+      <w:r>
+        <w:rPr>
+          <w:sz w:val="22"/>
+          <w:szCs w:val="22"/>
+        </w:rPr>
+        <w:t>aterloo, Ontario, September</w:t>
+      </w:r>
+      <w:r>
+        <w:rPr>
+          <w:sz w:val="22"/>
+          <w:szCs w:val="22"/>
+        </w:rPr>
+        <w:t xml:space="preserve"> – </w:t>
+      </w:r>
+      <w:r>
+        <w:rPr>
+          <w:sz w:val="22"/>
+          <w:szCs w:val="22"/>
+        </w:rPr>
+        <w:t>December 2009</w:t>
+      </w:r>
+    </w:p>
+    <w:p>
+      <w:pPr>
+        <w:rPr>
+          <w:sz w:val="22"/>
+          <w:szCs w:val="22"/>
+        </w:rPr>
+      </w:pPr>
     </w:p>
     <w:p>
       <w:pPr>
@@ -1389,17 +1170,37 @@
           <w:ilvl w:val="0"/>
           <w:numId w:val="1"/>
         </w:numPr>
-        <w:rPr>
-          <w:sz w:val="22"/>
-          <w:szCs w:val="22"/>
-        </w:rPr>
-      </w:pPr>
-      <w:r>
-        <w:rPr>
-          <w:sz w:val="22"/>
-          <w:szCs w:val="22"/>
-        </w:rPr>
-        <w:t>Created dynamic and branded web sites using JavaScript and CSS</w:t>
+        <w:spacing w:beforeLines="1" w:afterLines="1"/>
+        <w:rPr>
+          <w:rFonts w:ascii="Times" w:hAnsi="Times"/>
+          <w:sz w:val="20"/>
+          <w:szCs w:val="20"/>
+          <w:lang w:val="en-US"/>
+        </w:rPr>
+      </w:pPr>
+      <w:r>
+        <w:rPr>
+          <w:rFonts w:ascii="Times" w:hAnsi="Times"/>
+          <w:sz w:val="22"/>
+          <w:szCs w:val="22"/>
+        </w:rPr>
+        <w:t>Perform</w:t>
+      </w:r>
+      <w:r>
+        <w:rPr>
+          <w:rFonts w:ascii="Times" w:hAnsi="Times"/>
+          <w:sz w:val="22"/>
+          <w:szCs w:val="22"/>
+        </w:rPr>
+        <w:t>ed</w:t>
+      </w:r>
+      <w:r>
+        <w:rPr>
+          <w:rFonts w:ascii="Times" w:hAnsi="Times"/>
+          <w:sz w:val="22"/>
+          <w:szCs w:val="22"/>
+        </w:rPr>
+        <w:t xml:space="preserve"> BlackBerry browser performance testing and profiling</w:t>
       </w:r>
     </w:p>
     <w:p>
@@ -1408,109 +1209,54 @@
           <w:ilvl w:val="0"/>
           <w:numId w:val="1"/>
         </w:numPr>
-        <w:rPr>
-          <w:sz w:val="22"/>
-          <w:szCs w:val="22"/>
-        </w:rPr>
-      </w:pPr>
-      <w:r>
-        <w:rPr>
-          <w:sz w:val="22"/>
-          <w:szCs w:val="22"/>
-        </w:rPr>
-        <w:t>Handled daily issues reported to the Website Support Inbox</w:t>
-      </w:r>
-    </w:p>
-    <w:p>
-      <w:pPr>
-        <w:rPr>
-          <w:b/>
-          <w:sz w:val="22"/>
-          <w:szCs w:val="22"/>
-        </w:rPr>
-      </w:pPr>
-    </w:p>
-    <w:p>
-      <w:pPr>
-        <w:rPr>
-          <w:sz w:val="22"/>
-          <w:szCs w:val="22"/>
-        </w:rPr>
-      </w:pPr>
-      <w:r>
-        <w:rPr>
-          <w:b/>
-          <w:sz w:val="22"/>
-          <w:szCs w:val="22"/>
-        </w:rPr>
-        <w:t>Test Specialist</w:t>
-      </w:r>
-      <w:r>
-        <w:rPr>
-          <w:b/>
-          <w:sz w:val="22"/>
-          <w:szCs w:val="22"/>
-        </w:rPr>
-        <w:t xml:space="preserve">, </w:t>
-      </w:r>
-      <w:r>
-        <w:rPr>
-          <w:bCs/>
-          <w:sz w:val="22"/>
-          <w:szCs w:val="22"/>
-        </w:rPr>
-        <w:t>Agfa Healthcare</w:t>
-      </w:r>
-      <w:r>
-        <w:rPr>
-          <w:sz w:val="22"/>
-          <w:szCs w:val="22"/>
-        </w:rPr>
-        <w:t xml:space="preserve">, </w:t>
-      </w:r>
-      <w:r>
-        <w:rPr>
-          <w:sz w:val="22"/>
-          <w:szCs w:val="22"/>
-        </w:rPr>
-        <w:t>Waterloo</w:t>
-      </w:r>
-      <w:r>
-        <w:rPr>
-          <w:sz w:val="22"/>
-          <w:szCs w:val="22"/>
-        </w:rPr>
-        <w:t xml:space="preserve">, Ontario, </w:t>
-      </w:r>
-      <w:r>
-        <w:rPr>
-          <w:sz w:val="22"/>
-          <w:szCs w:val="22"/>
-        </w:rPr>
-        <w:t>May</w:t>
-      </w:r>
-      <w:r>
-        <w:rPr>
-          <w:sz w:val="22"/>
-          <w:szCs w:val="22"/>
-        </w:rPr>
-        <w:t xml:space="preserve"> – </w:t>
-      </w:r>
-      <w:r>
-        <w:rPr>
-          <w:sz w:val="22"/>
-          <w:szCs w:val="22"/>
-        </w:rPr>
-        <w:t>August 2008</w:t>
-      </w:r>
-    </w:p>
-    <w:p>
-      <w:pPr>
-        <w:rPr>
-          <w:sz w:val="22"/>
-          <w:szCs w:val="22"/>
-        </w:rPr>
-      </w:pPr>
+        <w:spacing w:beforeLines="1" w:afterLines="1"/>
+        <w:rPr>
+          <w:rFonts w:ascii="Times" w:hAnsi="Times"/>
+          <w:sz w:val="20"/>
+          <w:szCs w:val="20"/>
+          <w:lang w:val="en-US"/>
+        </w:rPr>
+      </w:pPr>
+      <w:r>
+        <w:rPr>
+          <w:rFonts w:ascii="Times" w:hAnsi="Times"/>
+          <w:sz w:val="22"/>
+          <w:szCs w:val="22"/>
+        </w:rPr>
+        <w:t>Wrote and contributed to testing tools in</w:t>
+      </w:r>
+      <w:r>
+        <w:rPr>
+          <w:rFonts w:ascii="Times" w:hAnsi="Times"/>
+          <w:sz w:val="22"/>
+          <w:szCs w:val="22"/>
+        </w:rPr>
+        <w:t xml:space="preserve"> </w:t>
+      </w:r>
+      <w:r>
+        <w:rPr>
+          <w:rFonts w:ascii="Times" w:hAnsi="Times"/>
+          <w:sz w:val="22"/>
+          <w:szCs w:val="22"/>
+        </w:rPr>
+        <w:t xml:space="preserve">VBA and </w:t>
+      </w:r>
+      <w:r>
+        <w:rPr>
+          <w:rFonts w:ascii="Times" w:hAnsi="Times"/>
+          <w:sz w:val="22"/>
+          <w:szCs w:val="22"/>
+        </w:rPr>
+        <w:t>C++</w:t>
+      </w:r>
+      <w:r>
+        <w:rPr>
+          <w:rFonts w:ascii="Times" w:hAnsi="Times"/>
+          <w:sz w:val="22"/>
+          <w:szCs w:val="22"/>
+        </w:rPr>
+        <w:t>, and provided documentation for said tools</w:t>
+      </w:r>
     </w:p>
     <w:p>
       <w:pPr>
@@ -1518,35 +1264,136 @@
           <w:ilvl w:val="0"/>
           <w:numId w:val="1"/>
         </w:numPr>
-        <w:rPr>
-          <w:sz w:val="22"/>
-          <w:szCs w:val="22"/>
-        </w:rPr>
-      </w:pPr>
-      <w:r>
-        <w:rPr>
-          <w:sz w:val="22"/>
-          <w:szCs w:val="22"/>
-          <w:lang w:val="en-US"/>
-        </w:rPr>
-        <w:t>Design</w:t>
-      </w:r>
-      <w:r>
-        <w:rPr>
-          <w:sz w:val="22"/>
-          <w:szCs w:val="22"/>
-          <w:lang w:val="en-US"/>
-        </w:rPr>
-        <w:t>ed and developed</w:t>
-      </w:r>
-      <w:r>
-        <w:rPr>
-          <w:sz w:val="22"/>
-          <w:szCs w:val="22"/>
-          <w:lang w:val="en-US"/>
-        </w:rPr>
-        <w:t xml:space="preserve"> automated test procedures</w:t>
-      </w:r>
+        <w:spacing w:beforeLines="1" w:afterLines="1"/>
+        <w:rPr>
+          <w:rFonts w:ascii="Times" w:hAnsi="Times"/>
+          <w:sz w:val="20"/>
+          <w:szCs w:val="20"/>
+          <w:lang w:val="en-US"/>
+        </w:rPr>
+      </w:pPr>
+      <w:r>
+        <w:rPr>
+          <w:rFonts w:ascii="Times" w:hAnsi="Times"/>
+          <w:sz w:val="22"/>
+          <w:szCs w:val="22"/>
+        </w:rPr>
+        <w:t>Test</w:t>
+      </w:r>
+      <w:r>
+        <w:rPr>
+          <w:rFonts w:ascii="Times" w:hAnsi="Times"/>
+          <w:sz w:val="22"/>
+          <w:szCs w:val="22"/>
+        </w:rPr>
+        <w:t>ed</w:t>
+      </w:r>
+      <w:r>
+        <w:rPr>
+          <w:rFonts w:ascii="Times" w:hAnsi="Times"/>
+          <w:sz w:val="22"/>
+          <w:szCs w:val="22"/>
+        </w:rPr>
+        <w:t xml:space="preserve"> various BlackBerry software systems</w:t>
+      </w:r>
+      <w:r>
+        <w:rPr>
+          <w:sz w:val="22"/>
+          <w:szCs w:val="22"/>
+        </w:rPr>
+        <w:t xml:space="preserve"> </w:t>
+      </w:r>
+    </w:p>
+    <w:p>
+      <w:pPr>
+        <w:rPr>
+          <w:b/>
+          <w:sz w:val="22"/>
+          <w:szCs w:val="22"/>
+        </w:rPr>
+      </w:pPr>
+    </w:p>
+    <w:p>
+      <w:pPr>
+        <w:rPr>
+          <w:sz w:val="22"/>
+          <w:szCs w:val="22"/>
+        </w:rPr>
+      </w:pPr>
+      <w:r>
+        <w:rPr>
+          <w:b/>
+          <w:sz w:val="22"/>
+          <w:szCs w:val="22"/>
+        </w:rPr>
+        <w:t>Application Developer</w:t>
+      </w:r>
+      <w:r>
+        <w:rPr>
+          <w:b/>
+          <w:sz w:val="22"/>
+          <w:szCs w:val="22"/>
+        </w:rPr>
+        <w:t xml:space="preserve">, </w:t>
+      </w:r>
+      <w:r>
+        <w:rPr>
+          <w:bCs/>
+          <w:sz w:val="22"/>
+          <w:szCs w:val="22"/>
+        </w:rPr>
+        <w:t>Sun Life Financial</w:t>
+      </w:r>
+      <w:r>
+        <w:rPr>
+          <w:sz w:val="22"/>
+          <w:szCs w:val="22"/>
+        </w:rPr>
+        <w:t xml:space="preserve">, </w:t>
+      </w:r>
+      <w:r>
+        <w:rPr>
+          <w:sz w:val="22"/>
+          <w:szCs w:val="22"/>
+        </w:rPr>
+        <w:t>Waterloo</w:t>
+      </w:r>
+      <w:r>
+        <w:rPr>
+          <w:sz w:val="22"/>
+          <w:szCs w:val="22"/>
+        </w:rPr>
+        <w:t xml:space="preserve">, Ontario, </w:t>
+      </w:r>
+      <w:r>
+        <w:rPr>
+          <w:sz w:val="22"/>
+          <w:szCs w:val="22"/>
+        </w:rPr>
+        <w:t>January</w:t>
+      </w:r>
+      <w:r>
+        <w:rPr>
+          <w:sz w:val="22"/>
+          <w:szCs w:val="22"/>
+        </w:rPr>
+        <w:t xml:space="preserve"> – </w:t>
+      </w:r>
+      <w:r>
+        <w:rPr>
+          <w:sz w:val="22"/>
+          <w:szCs w:val="22"/>
+        </w:rPr>
+        <w:t>April 2009</w:t>
+      </w:r>
+    </w:p>
+    <w:p>
+      <w:pPr>
+        <w:rPr>
+          <w:sz w:val="22"/>
+          <w:szCs w:val="22"/>
+        </w:rPr>
+      </w:pPr>
     </w:p>
     <w:p>
       <w:pPr>
@@ -1563,33 +1410,43 @@
         <w:rPr>
           <w:sz w:val="22"/>
           <w:szCs w:val="22"/>
-          <w:lang w:val="en-US"/>
-        </w:rPr>
-        <w:t>Created</w:t>
-      </w:r>
-      <w:r>
-        <w:rPr>
-          <w:sz w:val="22"/>
-          <w:szCs w:val="22"/>
-          <w:lang w:val="en-US"/>
-        </w:rPr>
-        <w:t xml:space="preserve"> execute</w:t>
-      </w:r>
-      <w:r>
-        <w:rPr>
-          <w:sz w:val="22"/>
-          <w:szCs w:val="22"/>
-          <w:lang w:val="en-US"/>
-        </w:rPr>
-        <w:t>d</w:t>
-      </w:r>
-      <w:r>
-        <w:rPr>
-          <w:sz w:val="22"/>
-          <w:szCs w:val="22"/>
-          <w:lang w:val="en-US"/>
-        </w:rPr>
-        <w:t xml:space="preserve"> reusable and maintainable automated scripts</w:t>
+        </w:rPr>
+        <w:t xml:space="preserve">Developed functionality for the company intranet portal using </w:t>
+      </w:r>
+      <w:r>
+        <w:rPr>
+          <w:sz w:val="22"/>
+          <w:szCs w:val="22"/>
+        </w:rPr>
+        <w:t>ASP</w:t>
+      </w:r>
+      <w:r>
+        <w:rPr>
+          <w:sz w:val="22"/>
+          <w:szCs w:val="22"/>
+        </w:rPr>
+        <w:t>.</w:t>
+      </w:r>
+      <w:r>
+        <w:rPr>
+          <w:sz w:val="22"/>
+          <w:szCs w:val="22"/>
+        </w:rPr>
+        <w:t>NET</w:t>
+      </w:r>
+      <w:r>
+        <w:rPr>
+          <w:sz w:val="22"/>
+          <w:szCs w:val="22"/>
+        </w:rPr>
+        <w:t>,</w:t>
+      </w:r>
+      <w:r>
+        <w:rPr>
+          <w:sz w:val="22"/>
+          <w:szCs w:val="22"/>
+        </w:rPr>
+        <w:t xml:space="preserve"> C# and Ajax</w:t>
       </w:r>
     </w:p>
     <w:p>
@@ -1607,231 +1464,9 @@
         <w:rPr>
           <w:sz w:val="22"/>
           <w:szCs w:val="22"/>
-          <w:lang w:val="en-US"/>
-        </w:rPr>
-        <w:t>Follow</w:t>
-      </w:r>
-      <w:r>
-        <w:rPr>
-          <w:sz w:val="22"/>
-          <w:szCs w:val="22"/>
-          <w:lang w:val="en-US"/>
-        </w:rPr>
-        <w:t>ed</w:t>
-      </w:r>
-      <w:r>
-        <w:rPr>
-          <w:sz w:val="22"/>
-          <w:szCs w:val="22"/>
-          <w:lang w:val="en-US"/>
-        </w:rPr>
-        <w:t xml:space="preserve"> development and testing standards and guidelines</w:t>
-      </w:r>
-    </w:p>
-    <w:p>
-      <w:pPr>
-        <w:ind w:left="360"/>
-        <w:rPr>
-          <w:sz w:val="22"/>
-          <w:szCs w:val="22"/>
-        </w:rPr>
-      </w:pPr>
-    </w:p>
-    <w:p>
-      <w:pPr>
-        <w:ind w:left="360"/>
-        <w:rPr>
-          <w:sz w:val="22"/>
-          <w:szCs w:val="22"/>
-        </w:rPr>
-      </w:pPr>
-    </w:p>
-    <w:p>
-      <w:pPr>
-        <w:ind w:left="360"/>
-        <w:rPr>
-          <w:sz w:val="22"/>
-          <w:szCs w:val="22"/>
-        </w:rPr>
-      </w:pPr>
-    </w:p>
-    <w:p>
-      <w:pPr>
-        <w:pStyle w:val="Heading3"/>
-        <w:spacing w:after="0"/>
-        <w:rPr>
-          <w:rFonts w:ascii="Times New Roman" w:hAnsi="Times New Roman" w:cs="Times New Roman"/>
-          <w:b w:val="0"/>
-          <w:sz w:val="22"/>
-          <w:szCs w:val="22"/>
-        </w:rPr>
-      </w:pPr>
-      <w:r>
-        <w:rPr>
-          <w:rFonts w:ascii="Times New Roman" w:hAnsi="Times New Roman" w:cs="Times New Roman"/>
-          <w:sz w:val="22"/>
-          <w:szCs w:val="22"/>
-        </w:rPr>
-        <w:t>EDUCATION</w:t>
-      </w:r>
-    </w:p>
-    <w:p>
-      <w:pPr>
-        <w:rPr>
-          <w:sz w:val="22"/>
-          <w:szCs w:val="22"/>
-        </w:rPr>
-      </w:pPr>
-    </w:p>
-    <w:p>
-      <w:pPr>
-        <w:pStyle w:val="Footer"/>
-        <w:tabs>
-          <w:tab w:val="clear" w:pos="4320"/>
-          <w:tab w:val="clear" w:pos="8640"/>
-        </w:tabs>
-        <w:rPr>
-          <w:szCs w:val="22"/>
-        </w:rPr>
-      </w:pPr>
-      <w:bookmarkStart w:id="2" w:name="OLE_LINK8"/>
-      <w:r>
-        <w:rPr>
-          <w:b/>
-          <w:szCs w:val="22"/>
-        </w:rPr>
-        <w:t>Candidate for Bachelor of Computer Science</w:t>
-      </w:r>
-      <w:r>
-        <w:rPr>
-          <w:szCs w:val="22"/>
-        </w:rPr>
-        <w:t>, Computer Science, Co-op Program, University of Waterloo, Wa</w:t>
-      </w:r>
-      <w:r>
-        <w:rPr>
-          <w:szCs w:val="22"/>
-        </w:rPr>
-        <w:t>terloo, Ontario, September 2007 –</w:t>
-      </w:r>
-      <w:r>
-        <w:rPr>
-          <w:szCs w:val="22"/>
-        </w:rPr>
-        <w:t xml:space="preserve"> present</w:t>
-      </w:r>
-    </w:p>
-    <w:p>
-      <w:pPr>
-        <w:pStyle w:val="Footer"/>
-        <w:tabs>
-          <w:tab w:val="clear" w:pos="4320"/>
-          <w:tab w:val="clear" w:pos="8640"/>
-          <w:tab w:val="right" w:pos="9360"/>
-        </w:tabs>
-        <w:rPr>
-          <w:szCs w:val="22"/>
-        </w:rPr>
-      </w:pPr>
-      <w:bookmarkStart w:id="3" w:name="OLE_LINK9"/>
-      <w:bookmarkEnd w:id="2"/>
-    </w:p>
-    <w:p>
-      <w:pPr>
-        <w:pStyle w:val="Footer"/>
-        <w:tabs>
-          <w:tab w:val="clear" w:pos="4320"/>
-          <w:tab w:val="clear" w:pos="8640"/>
-          <w:tab w:val="right" w:pos="9360"/>
-        </w:tabs>
-        <w:ind w:left="720"/>
-        <w:rPr>
-          <w:b/>
-          <w:bCs/>
-          <w:szCs w:val="22"/>
-        </w:rPr>
-      </w:pPr>
-      <w:r>
-        <w:rPr>
-          <w:b/>
-          <w:bCs/>
-          <w:szCs w:val="22"/>
-        </w:rPr>
-        <w:t>Relevant Assignments:</w:t>
-      </w:r>
-    </w:p>
-    <w:p>
-      <w:pPr>
-        <w:pStyle w:val="Footer"/>
-        <w:tabs>
-          <w:tab w:val="clear" w:pos="4320"/>
-          <w:tab w:val="clear" w:pos="8640"/>
-          <w:tab w:val="right" w:pos="9360"/>
-        </w:tabs>
-        <w:ind w:left="720"/>
-        <w:rPr>
-          <w:b/>
-          <w:bCs/>
-          <w:szCs w:val="22"/>
-        </w:rPr>
-      </w:pPr>
-    </w:p>
-    <w:p>
-      <w:pPr>
-        <w:ind w:left="720"/>
-        <w:rPr>
-          <w:sz w:val="22"/>
-          <w:szCs w:val="22"/>
-        </w:rPr>
-      </w:pPr>
-      <w:r>
-        <w:rPr>
-          <w:b/>
-          <w:bCs/>
-          <w:sz w:val="22"/>
-          <w:szCs w:val="22"/>
-        </w:rPr>
-        <w:t>Genetic Algorithm (In Progress)</w:t>
-      </w:r>
-      <w:r>
-        <w:rPr>
-          <w:b/>
-          <w:bCs/>
-          <w:sz w:val="22"/>
-          <w:szCs w:val="22"/>
-        </w:rPr>
-        <w:t xml:space="preserve">, </w:t>
-      </w:r>
-      <w:r>
-        <w:rPr>
-          <w:sz w:val="22"/>
-          <w:szCs w:val="22"/>
-        </w:rPr>
-        <w:t>Artificial Intelligence,</w:t>
-      </w:r>
-      <w:r>
-        <w:rPr>
-          <w:sz w:val="22"/>
-          <w:szCs w:val="22"/>
-        </w:rPr>
-        <w:t xml:space="preserve"> </w:t>
-      </w:r>
-      <w:r>
-        <w:rPr>
-          <w:sz w:val="22"/>
-          <w:szCs w:val="22"/>
-        </w:rPr>
-        <w:t>May – August 2011</w:t>
-      </w:r>
-    </w:p>
-    <w:p>
-      <w:pPr>
-        <w:ind w:left="720"/>
-        <w:rPr>
-          <w:sz w:val="22"/>
-          <w:szCs w:val="22"/>
-        </w:rPr>
-      </w:pPr>
+        </w:rPr>
+        <w:t>Created dynamic and branded web sites using JavaScript and CSS</w:t>
+      </w:r>
     </w:p>
     <w:p>
       <w:pPr>
@@ -1839,42 +1474,109 @@
           <w:ilvl w:val="0"/>
           <w:numId w:val="1"/>
         </w:numPr>
-        <w:tabs>
-          <w:tab w:val="clear" w:pos="720"/>
-          <w:tab w:val="num" w:pos="1440"/>
-        </w:tabs>
-        <w:ind w:left="1440"/>
-        <w:rPr>
-          <w:sz w:val="22"/>
-          <w:szCs w:val="22"/>
-        </w:rPr>
-      </w:pPr>
-      <w:r>
-        <w:rPr>
-          <w:sz w:val="22"/>
-          <w:szCs w:val="22"/>
-          <w:lang w:val="en-US"/>
-        </w:rPr>
-        <w:t xml:space="preserve">Implementing a solution to the </w:t>
-      </w:r>
-      <w:proofErr w:type="spellStart"/>
-      <w:r>
-        <w:rPr>
-          <w:sz w:val="22"/>
-          <w:szCs w:val="22"/>
-          <w:lang w:val="en-US"/>
-        </w:rPr>
-        <w:t>Wordsnakes</w:t>
-      </w:r>
-      <w:proofErr w:type="spellEnd"/>
-      <w:r>
-        <w:rPr>
-          <w:sz w:val="22"/>
-          <w:szCs w:val="22"/>
-          <w:lang w:val="en-US"/>
-        </w:rPr>
-        <w:t xml:space="preserve"> game</w:t>
-      </w:r>
+        <w:rPr>
+          <w:sz w:val="22"/>
+          <w:szCs w:val="22"/>
+        </w:rPr>
+      </w:pPr>
+      <w:r>
+        <w:rPr>
+          <w:sz w:val="22"/>
+          <w:szCs w:val="22"/>
+        </w:rPr>
+        <w:t>Handled daily issues reported to the Website Support Inbox</w:t>
+      </w:r>
+    </w:p>
+    <w:p>
+      <w:pPr>
+        <w:rPr>
+          <w:b/>
+          <w:sz w:val="22"/>
+          <w:szCs w:val="22"/>
+        </w:rPr>
+      </w:pPr>
+    </w:p>
+    <w:p>
+      <w:pPr>
+        <w:rPr>
+          <w:sz w:val="22"/>
+          <w:szCs w:val="22"/>
+        </w:rPr>
+      </w:pPr>
+      <w:r>
+        <w:rPr>
+          <w:b/>
+          <w:sz w:val="22"/>
+          <w:szCs w:val="22"/>
+        </w:rPr>
+        <w:t>Test Specialist</w:t>
+      </w:r>
+      <w:r>
+        <w:rPr>
+          <w:b/>
+          <w:sz w:val="22"/>
+          <w:szCs w:val="22"/>
+        </w:rPr>
+        <w:t xml:space="preserve">, </w:t>
+      </w:r>
+      <w:r>
+        <w:rPr>
+          <w:bCs/>
+          <w:sz w:val="22"/>
+          <w:szCs w:val="22"/>
+        </w:rPr>
+        <w:t>Agfa Healthcare</w:t>
+      </w:r>
+      <w:r>
+        <w:rPr>
+          <w:sz w:val="22"/>
+          <w:szCs w:val="22"/>
+        </w:rPr>
+        <w:t xml:space="preserve">, </w:t>
+      </w:r>
+      <w:r>
+        <w:rPr>
+          <w:sz w:val="22"/>
+          <w:szCs w:val="22"/>
+        </w:rPr>
+        <w:t>Waterloo</w:t>
+      </w:r>
+      <w:r>
+        <w:rPr>
+          <w:sz w:val="22"/>
+          <w:szCs w:val="22"/>
+        </w:rPr>
+        <w:t xml:space="preserve">, Ontario, </w:t>
+      </w:r>
+      <w:r>
+        <w:rPr>
+          <w:sz w:val="22"/>
+          <w:szCs w:val="22"/>
+        </w:rPr>
+        <w:t>May</w:t>
+      </w:r>
+      <w:r>
+        <w:rPr>
+          <w:sz w:val="22"/>
+          <w:szCs w:val="22"/>
+        </w:rPr>
+        <w:t xml:space="preserve"> – </w:t>
+      </w:r>
+      <w:r>
+        <w:rPr>
+          <w:sz w:val="22"/>
+          <w:szCs w:val="22"/>
+        </w:rPr>
+        <w:t>August 2008</w:t>
+      </w:r>
+    </w:p>
+    <w:p>
+      <w:pPr>
+        <w:rPr>
+          <w:sz w:val="22"/>
+          <w:szCs w:val="22"/>
+        </w:rPr>
+      </w:pPr>
     </w:p>
     <w:p>
       <w:pPr>
@@ -1882,105 +1584,35 @@
           <w:ilvl w:val="0"/>
           <w:numId w:val="1"/>
         </w:numPr>
-        <w:tabs>
-          <w:tab w:val="clear" w:pos="720"/>
-          <w:tab w:val="num" w:pos="1440"/>
-        </w:tabs>
-        <w:ind w:left="1440"/>
-        <w:rPr>
-          <w:b/>
-          <w:bCs/>
-          <w:szCs w:val="22"/>
-        </w:rPr>
-      </w:pPr>
-      <w:r>
-        <w:rPr>
-          <w:sz w:val="22"/>
-          <w:szCs w:val="22"/>
-          <w:lang w:val="en-US"/>
-        </w:rPr>
-        <w:t>Using a combination of graph-searching with heuristics and a genetic algorithm</w:t>
-      </w:r>
-    </w:p>
-    <w:p>
-      <w:pPr>
-        <w:rPr>
-          <w:b/>
-          <w:bCs/>
-          <w:szCs w:val="22"/>
-        </w:rPr>
-      </w:pPr>
-    </w:p>
-    <w:p>
-      <w:pPr>
-        <w:ind w:left="720"/>
-        <w:rPr>
-          <w:sz w:val="22"/>
-          <w:szCs w:val="22"/>
-        </w:rPr>
-      </w:pPr>
-      <w:r>
-        <w:rPr>
-          <w:b/>
-          <w:bCs/>
-          <w:sz w:val="22"/>
-          <w:szCs w:val="22"/>
-        </w:rPr>
-        <w:t>Operating System</w:t>
-      </w:r>
-      <w:r>
-        <w:rPr>
-          <w:b/>
-          <w:bCs/>
-          <w:sz w:val="22"/>
-          <w:szCs w:val="22"/>
-        </w:rPr>
-        <w:t xml:space="preserve">, </w:t>
-      </w:r>
-      <w:r>
-        <w:rPr>
-          <w:sz w:val="22"/>
-          <w:szCs w:val="22"/>
-        </w:rPr>
-        <w:t>Operating Systems,</w:t>
-      </w:r>
-      <w:r>
-        <w:rPr>
-          <w:sz w:val="22"/>
-          <w:szCs w:val="22"/>
-        </w:rPr>
-        <w:t xml:space="preserve"> </w:t>
-      </w:r>
-      <w:r>
-        <w:rPr>
-          <w:sz w:val="22"/>
-          <w:szCs w:val="22"/>
-        </w:rPr>
-        <w:t>January</w:t>
-      </w:r>
-      <w:r>
-        <w:rPr>
-          <w:sz w:val="22"/>
-          <w:szCs w:val="22"/>
-        </w:rPr>
-        <w:t xml:space="preserve"> – </w:t>
-      </w:r>
-      <w:r>
-        <w:rPr>
-          <w:sz w:val="22"/>
-          <w:szCs w:val="22"/>
-        </w:rPr>
-        <w:t>April 2010</w:t>
-      </w:r>
-    </w:p>
-    <w:p>
-      <w:pPr>
-        <w:ind w:left="720"/>
-        <w:rPr>
-          <w:sz w:val="22"/>
-          <w:szCs w:val="22"/>
-        </w:rPr>
-      </w:pPr>
+        <w:rPr>
+          <w:sz w:val="22"/>
+          <w:szCs w:val="22"/>
+        </w:rPr>
+      </w:pPr>
+      <w:r>
+        <w:rPr>
+          <w:sz w:val="22"/>
+          <w:szCs w:val="22"/>
+          <w:lang w:val="en-US"/>
+        </w:rPr>
+        <w:t>Design</w:t>
+      </w:r>
+      <w:r>
+        <w:rPr>
+          <w:sz w:val="22"/>
+          <w:szCs w:val="22"/>
+          <w:lang w:val="en-US"/>
+        </w:rPr>
+        <w:t>ed and developed</w:t>
+      </w:r>
+      <w:r>
+        <w:rPr>
+          <w:sz w:val="22"/>
+          <w:szCs w:val="22"/>
+          <w:lang w:val="en-US"/>
+        </w:rPr>
+        <w:t xml:space="preserve"> automated test procedures</w:t>
+      </w:r>
     </w:p>
     <w:p>
       <w:pPr>
@@ -1988,22 +1620,42 @@
           <w:ilvl w:val="0"/>
           <w:numId w:val="1"/>
         </w:numPr>
-        <w:tabs>
-          <w:tab w:val="clear" w:pos="720"/>
-          <w:tab w:val="num" w:pos="1440"/>
-        </w:tabs>
-        <w:ind w:left="1440"/>
-        <w:rPr>
-          <w:sz w:val="22"/>
-          <w:szCs w:val="22"/>
-        </w:rPr>
-      </w:pPr>
-      <w:r>
-        <w:rPr>
-          <w:sz w:val="22"/>
-          <w:szCs w:val="22"/>
-        </w:rPr>
-        <w:t>Implemented several core components of an operating system</w:t>
+        <w:rPr>
+          <w:sz w:val="22"/>
+          <w:szCs w:val="22"/>
+        </w:rPr>
+      </w:pPr>
+      <w:r>
+        <w:rPr>
+          <w:sz w:val="22"/>
+          <w:szCs w:val="22"/>
+          <w:lang w:val="en-US"/>
+        </w:rPr>
+        <w:t>Created</w:t>
+      </w:r>
+      <w:r>
+        <w:rPr>
+          <w:sz w:val="22"/>
+          <w:szCs w:val="22"/>
+          <w:lang w:val="en-US"/>
+        </w:rPr>
+        <w:t xml:space="preserve"> execute</w:t>
+      </w:r>
+      <w:r>
+        <w:rPr>
+          <w:sz w:val="22"/>
+          <w:szCs w:val="22"/>
+          <w:lang w:val="en-US"/>
+        </w:rPr>
+        <w:t>d</w:t>
+      </w:r>
+      <w:r>
+        <w:rPr>
+          <w:sz w:val="22"/>
+          <w:szCs w:val="22"/>
+          <w:lang w:val="en-US"/>
+        </w:rPr>
+        <w:t xml:space="preserve"> reusable and maintainable automated scripts</w:t>
       </w:r>
     </w:p>
     <w:p>
@@ -2012,37 +1664,240 @@
           <w:ilvl w:val="0"/>
           <w:numId w:val="1"/>
         </w:numPr>
-        <w:tabs>
-          <w:tab w:val="clear" w:pos="720"/>
-          <w:tab w:val="num" w:pos="1440"/>
-        </w:tabs>
-        <w:ind w:left="1440"/>
-        <w:rPr>
-          <w:sz w:val="22"/>
-          <w:szCs w:val="22"/>
-        </w:rPr>
-      </w:pPr>
-      <w:r>
-        <w:rPr>
-          <w:sz w:val="22"/>
-          <w:szCs w:val="22"/>
-        </w:rPr>
-        <w:t xml:space="preserve">Designed and </w:t>
-      </w:r>
-      <w:r>
-        <w:rPr>
-          <w:sz w:val="22"/>
-          <w:szCs w:val="22"/>
-        </w:rPr>
-        <w:t>developed</w:t>
-      </w:r>
-      <w:r>
-        <w:rPr>
-          <w:sz w:val="22"/>
-          <w:szCs w:val="22"/>
-        </w:rPr>
-        <w:t xml:space="preserve"> virtual and physical memory management systems, and memory paging functionality</w:t>
-      </w:r>
+        <w:rPr>
+          <w:sz w:val="22"/>
+          <w:szCs w:val="22"/>
+        </w:rPr>
+      </w:pPr>
+      <w:r>
+        <w:rPr>
+          <w:sz w:val="22"/>
+          <w:szCs w:val="22"/>
+          <w:lang w:val="en-US"/>
+        </w:rPr>
+        <w:t>Follow</w:t>
+      </w:r>
+      <w:r>
+        <w:rPr>
+          <w:sz w:val="22"/>
+          <w:szCs w:val="22"/>
+          <w:lang w:val="en-US"/>
+        </w:rPr>
+        <w:t>ed</w:t>
+      </w:r>
+      <w:r>
+        <w:rPr>
+          <w:sz w:val="22"/>
+          <w:szCs w:val="22"/>
+          <w:lang w:val="en-US"/>
+        </w:rPr>
+        <w:t xml:space="preserve"> development and testing standards and guidelines</w:t>
+      </w:r>
+    </w:p>
+    <w:p>
+      <w:pPr>
+        <w:ind w:left="360"/>
+        <w:rPr>
+          <w:sz w:val="22"/>
+          <w:szCs w:val="22"/>
+        </w:rPr>
+      </w:pPr>
+    </w:p>
+    <w:p>
+      <w:pPr>
+        <w:ind w:left="360"/>
+        <w:rPr>
+          <w:sz w:val="22"/>
+          <w:szCs w:val="22"/>
+        </w:rPr>
+      </w:pPr>
+    </w:p>
+    <w:p>
+      <w:pPr>
+        <w:ind w:left="360"/>
+        <w:rPr>
+          <w:sz w:val="22"/>
+          <w:szCs w:val="22"/>
+        </w:rPr>
+      </w:pPr>
+    </w:p>
+    <w:p>
+      <w:pPr>
+        <w:pStyle w:val="Heading3"/>
+        <w:spacing w:after="0"/>
+        <w:rPr>
+          <w:rFonts w:ascii="Times New Roman" w:hAnsi="Times New Roman" w:cs="Times New Roman"/>
+          <w:b w:val="0"/>
+          <w:sz w:val="22"/>
+          <w:szCs w:val="22"/>
+        </w:rPr>
+      </w:pPr>
+      <w:r>
+        <w:rPr>
+          <w:rFonts w:ascii="Times New Roman" w:hAnsi="Times New Roman" w:cs="Times New Roman"/>
+          <w:sz w:val="22"/>
+          <w:szCs w:val="22"/>
+        </w:rPr>
+        <w:t>EDUCATION</w:t>
+      </w:r>
+    </w:p>
+    <w:p>
+      <w:pPr>
+        <w:rPr>
+          <w:sz w:val="22"/>
+          <w:szCs w:val="22"/>
+        </w:rPr>
+      </w:pPr>
+    </w:p>
+    <w:p>
+      <w:pPr>
+        <w:pStyle w:val="Footer"/>
+        <w:tabs>
+          <w:tab w:val="clear" w:pos="4320"/>
+          <w:tab w:val="clear" w:pos="8640"/>
+        </w:tabs>
+        <w:rPr>
+          <w:szCs w:val="22"/>
+        </w:rPr>
+      </w:pPr>
+      <w:bookmarkStart w:id="2" w:name="OLE_LINK8"/>
+      <w:r>
+        <w:rPr>
+          <w:b/>
+          <w:szCs w:val="22"/>
+        </w:rPr>
+        <w:t>Candidate for Bachelor of Computer Science</w:t>
+      </w:r>
+      <w:r>
+        <w:rPr>
+          <w:szCs w:val="22"/>
+        </w:rPr>
+        <w:t>, Computer Science, Co-op Program, University of Waterloo, Wa</w:t>
+      </w:r>
+      <w:r>
+        <w:rPr>
+          <w:szCs w:val="22"/>
+        </w:rPr>
+        <w:t>terloo, Ontario, September 2007 –</w:t>
+      </w:r>
+      <w:r>
+        <w:rPr>
+          <w:szCs w:val="22"/>
+        </w:rPr>
+        <w:t xml:space="preserve"> present</w:t>
+      </w:r>
+    </w:p>
+    <w:p>
+      <w:pPr>
+        <w:pStyle w:val="Footer"/>
+        <w:tabs>
+          <w:tab w:val="clear" w:pos="4320"/>
+          <w:tab w:val="clear" w:pos="8640"/>
+          <w:tab w:val="right" w:pos="9360"/>
+        </w:tabs>
+        <w:rPr>
+          <w:szCs w:val="22"/>
+        </w:rPr>
+      </w:pPr>
+      <w:bookmarkStart w:id="3" w:name="OLE_LINK9"/>
+      <w:bookmarkEnd w:id="2"/>
+    </w:p>
+    <w:p>
+      <w:pPr>
+        <w:pStyle w:val="Footer"/>
+        <w:tabs>
+          <w:tab w:val="clear" w:pos="4320"/>
+          <w:tab w:val="clear" w:pos="8640"/>
+          <w:tab w:val="right" w:pos="9360"/>
+        </w:tabs>
+        <w:ind w:left="720"/>
+        <w:rPr>
+          <w:b/>
+          <w:bCs/>
+          <w:szCs w:val="22"/>
+        </w:rPr>
+      </w:pPr>
+      <w:r>
+        <w:rPr>
+          <w:b/>
+          <w:bCs/>
+          <w:szCs w:val="22"/>
+        </w:rPr>
+        <w:t>Relevant Assignments:</w:t>
+      </w:r>
+    </w:p>
+    <w:p>
+      <w:pPr>
+        <w:pStyle w:val="Footer"/>
+        <w:tabs>
+          <w:tab w:val="clear" w:pos="4320"/>
+          <w:tab w:val="clear" w:pos="8640"/>
+          <w:tab w:val="right" w:pos="9360"/>
+        </w:tabs>
+        <w:ind w:left="720"/>
+        <w:rPr>
+          <w:b/>
+          <w:bCs/>
+          <w:szCs w:val="22"/>
+        </w:rPr>
+      </w:pPr>
+    </w:p>
+    <w:p>
+      <w:pPr>
+        <w:ind w:left="720"/>
+        <w:rPr>
+          <w:sz w:val="22"/>
+          <w:szCs w:val="22"/>
+        </w:rPr>
+      </w:pPr>
+      <w:r>
+        <w:rPr>
+          <w:b/>
+          <w:bCs/>
+          <w:sz w:val="22"/>
+          <w:szCs w:val="22"/>
+        </w:rPr>
+        <w:t>Genetic Algorithm (In Progress)</w:t>
+      </w:r>
+      <w:r>
+        <w:rPr>
+          <w:b/>
+          <w:bCs/>
+          <w:sz w:val="22"/>
+          <w:szCs w:val="22"/>
+        </w:rPr>
+        <w:t xml:space="preserve">, </w:t>
+      </w:r>
+      <w:r>
+        <w:rPr>
+          <w:sz w:val="22"/>
+          <w:szCs w:val="22"/>
+        </w:rPr>
+        <w:t>Artificial Intelligence,</w:t>
+      </w:r>
+      <w:r>
+        <w:rPr>
+          <w:sz w:val="22"/>
+          <w:szCs w:val="22"/>
+        </w:rPr>
+        <w:t xml:space="preserve"> </w:t>
+      </w:r>
+      <w:r>
+        <w:rPr>
+          <w:sz w:val="22"/>
+          <w:szCs w:val="22"/>
+        </w:rPr>
+        <w:t>May – August 2011</w:t>
+      </w:r>
+    </w:p>
+    <w:p>
+      <w:pPr>
+        <w:ind w:left="720"/>
+        <w:rPr>
+          <w:sz w:val="22"/>
+          <w:szCs w:val="22"/>
+        </w:rPr>
+      </w:pPr>
     </w:p>
     <w:p>
       <w:pPr>
@@ -2064,8 +1919,9 @@
         <w:rPr>
           <w:sz w:val="22"/>
           <w:szCs w:val="22"/>
-        </w:rPr>
-        <w:t>Implemented several standard system calls including fork and exec</w:t>
+          <w:lang w:val="en-US"/>
+        </w:rPr>
+        <w:t>Implementing a solution to the Wordsnakes game</w:t>
       </w:r>
     </w:p>
     <w:p>
@@ -2080,69 +1936,37 @@
         </w:tabs>
         <w:ind w:left="1440"/>
         <w:rPr>
-          <w:sz w:val="22"/>
-          <w:szCs w:val="22"/>
-        </w:rPr>
-      </w:pPr>
-      <w:bookmarkStart w:id="4" w:name="OLE_LINK6"/>
-      <w:r>
-        <w:rPr>
-          <w:sz w:val="22"/>
-          <w:szCs w:val="22"/>
-        </w:rPr>
-        <w:t xml:space="preserve">Coordinated and organized </w:t>
-      </w:r>
-      <w:r>
-        <w:rPr>
-          <w:sz w:val="22"/>
-          <w:szCs w:val="22"/>
-        </w:rPr>
-        <w:t xml:space="preserve">efforts </w:t>
-      </w:r>
-      <w:r>
-        <w:rPr>
-          <w:sz w:val="22"/>
-          <w:szCs w:val="22"/>
-        </w:rPr>
-        <w:t>in</w:t>
-      </w:r>
-      <w:r>
-        <w:rPr>
-          <w:sz w:val="22"/>
-          <w:szCs w:val="22"/>
-        </w:rPr>
-        <w:t xml:space="preserve"> a team of three</w:t>
-      </w:r>
-    </w:p>
-    <w:bookmarkEnd w:id="4"/>
-    <w:p>
-      <w:pPr>
-        <w:ind w:left="720"/>
-        <w:rPr>
           <w:b/>
           <w:bCs/>
-          <w:sz w:val="22"/>
-          <w:szCs w:val="22"/>
-        </w:rPr>
-      </w:pPr>
-    </w:p>
-    <w:p>
-      <w:pPr>
-        <w:ind w:left="720"/>
-        <w:rPr>
-          <w:sz w:val="22"/>
-          <w:szCs w:val="22"/>
-        </w:rPr>
-      </w:pPr>
-      <w:r>
+          <w:szCs w:val="22"/>
+        </w:rPr>
+      </w:pPr>
+      <w:r>
+        <w:rPr>
+          <w:sz w:val="22"/>
+          <w:szCs w:val="22"/>
+          <w:lang w:val="en-US"/>
+        </w:rPr>
+        <w:t>Using a combination of graph-searching with heuristics and a genetic algorithm</w:t>
+      </w:r>
+    </w:p>
+    <w:p>
+      <w:pPr>
         <w:rPr>
           <w:b/>
           <w:bCs/>
-          <w:sz w:val="22"/>
-          <w:szCs w:val="22"/>
-        </w:rPr>
-        <w:t>Card Game Design</w:t>
-      </w:r>
+          <w:szCs w:val="22"/>
+        </w:rPr>
+      </w:pPr>
+    </w:p>
+    <w:p>
+      <w:pPr>
+        <w:ind w:left="720"/>
+        <w:rPr>
+          <w:sz w:val="22"/>
+          <w:szCs w:val="22"/>
+        </w:rPr>
+      </w:pPr>
       <w:r>
         <w:rPr>
           <w:b/>
@@ -2150,6 +1974,15 @@
           <w:sz w:val="22"/>
           <w:szCs w:val="22"/>
         </w:rPr>
+        <w:t>Operating System</w:t>
+      </w:r>
+      <w:r>
+        <w:rPr>
+          <w:b/>
+          <w:bCs/>
+          <w:sz w:val="22"/>
+          <w:szCs w:val="22"/>
+        </w:rPr>
         <w:t xml:space="preserve">, </w:t>
       </w:r>
       <w:r>
@@ -2157,14 +1990,7 @@
           <w:sz w:val="22"/>
           <w:szCs w:val="22"/>
         </w:rPr>
-        <w:t>Software Abstraction and Specification</w:t>
-      </w:r>
-      <w:r>
-        <w:rPr>
-          <w:sz w:val="22"/>
-          <w:szCs w:val="22"/>
-        </w:rPr>
-        <w:t>,</w:t>
+        <w:t>Operating Systems,</w:t>
       </w:r>
       <w:r>
         <w:rPr>
@@ -2178,7 +2004,7 @@
           <w:sz w:val="22"/>
           <w:szCs w:val="22"/>
         </w:rPr>
-        <w:t>May</w:t>
+        <w:t>January</w:t>
       </w:r>
       <w:r>
         <w:rPr>
@@ -2192,14 +2018,7 @@
           <w:sz w:val="22"/>
           <w:szCs w:val="22"/>
         </w:rPr>
-        <w:t>August</w:t>
-      </w:r>
-      <w:r>
-        <w:rPr>
-          <w:sz w:val="22"/>
-          <w:szCs w:val="22"/>
-        </w:rPr>
-        <w:t xml:space="preserve"> 2009</w:t>
+        <w:t>April 2010</w:t>
       </w:r>
     </w:p>
     <w:p>
@@ -2232,7 +2051,7 @@
           <w:sz w:val="22"/>
           <w:szCs w:val="22"/>
         </w:rPr>
-        <w:t>Created a fully featured graphical Euchre game</w:t>
+        <w:t>Implemented several core components of an operating system</w:t>
       </w:r>
     </w:p>
     <w:p>
@@ -2256,21 +2075,21 @@
           <w:sz w:val="22"/>
           <w:szCs w:val="22"/>
         </w:rPr>
-        <w:t>Worked in a group of two, u</w:t>
-      </w:r>
-      <w:r>
-        <w:rPr>
-          <w:sz w:val="22"/>
-          <w:szCs w:val="22"/>
-        </w:rPr>
-        <w:t xml:space="preserve">sing Subversion to organize </w:t>
-      </w:r>
-      <w:r>
-        <w:rPr>
-          <w:sz w:val="22"/>
-          <w:szCs w:val="22"/>
-        </w:rPr>
-        <w:t>code</w:t>
+        <w:t xml:space="preserve">Designed and </w:t>
+      </w:r>
+      <w:r>
+        <w:rPr>
+          <w:sz w:val="22"/>
+          <w:szCs w:val="22"/>
+        </w:rPr>
+        <w:t>developed</w:t>
+      </w:r>
+      <w:r>
+        <w:rPr>
+          <w:sz w:val="22"/>
+          <w:szCs w:val="22"/>
+        </w:rPr>
+        <w:t xml:space="preserve"> virtual and physical memory management systems, and memory paging functionality</w:t>
       </w:r>
     </w:p>
     <w:p>
@@ -2294,6 +2113,235 @@
           <w:sz w:val="22"/>
           <w:szCs w:val="22"/>
         </w:rPr>
+        <w:t>Implemented several standard system calls including fork and exec</w:t>
+      </w:r>
+    </w:p>
+    <w:p>
+      <w:pPr>
+        <w:numPr>
+          <w:ilvl w:val="0"/>
+          <w:numId w:val="1"/>
+        </w:numPr>
+        <w:tabs>
+          <w:tab w:val="clear" w:pos="720"/>
+          <w:tab w:val="num" w:pos="1440"/>
+        </w:tabs>
+        <w:ind w:left="1440"/>
+        <w:rPr>
+          <w:sz w:val="22"/>
+          <w:szCs w:val="22"/>
+        </w:rPr>
+      </w:pPr>
+      <w:bookmarkStart w:id="4" w:name="OLE_LINK6"/>
+      <w:r>
+        <w:rPr>
+          <w:sz w:val="22"/>
+          <w:szCs w:val="22"/>
+        </w:rPr>
+        <w:t xml:space="preserve">Coordinated and organized </w:t>
+      </w:r>
+      <w:r>
+        <w:rPr>
+          <w:sz w:val="22"/>
+          <w:szCs w:val="22"/>
+        </w:rPr>
+        <w:t xml:space="preserve">efforts </w:t>
+      </w:r>
+      <w:r>
+        <w:rPr>
+          <w:sz w:val="22"/>
+          <w:szCs w:val="22"/>
+        </w:rPr>
+        <w:t>in</w:t>
+      </w:r>
+      <w:r>
+        <w:rPr>
+          <w:sz w:val="22"/>
+          <w:szCs w:val="22"/>
+        </w:rPr>
+        <w:t xml:space="preserve"> a team of three</w:t>
+      </w:r>
+    </w:p>
+    <w:bookmarkEnd w:id="4"/>
+    <w:p>
+      <w:pPr>
+        <w:ind w:left="720"/>
+        <w:rPr>
+          <w:b/>
+          <w:bCs/>
+          <w:sz w:val="22"/>
+          <w:szCs w:val="22"/>
+        </w:rPr>
+      </w:pPr>
+    </w:p>
+    <w:p>
+      <w:pPr>
+        <w:ind w:left="720"/>
+        <w:rPr>
+          <w:sz w:val="22"/>
+          <w:szCs w:val="22"/>
+        </w:rPr>
+      </w:pPr>
+      <w:r>
+        <w:rPr>
+          <w:b/>
+          <w:bCs/>
+          <w:sz w:val="22"/>
+          <w:szCs w:val="22"/>
+        </w:rPr>
+        <w:t>Card Game Design</w:t>
+      </w:r>
+      <w:r>
+        <w:rPr>
+          <w:b/>
+          <w:bCs/>
+          <w:sz w:val="22"/>
+          <w:szCs w:val="22"/>
+        </w:rPr>
+        <w:t xml:space="preserve">, </w:t>
+      </w:r>
+      <w:r>
+        <w:rPr>
+          <w:sz w:val="22"/>
+          <w:szCs w:val="22"/>
+        </w:rPr>
+        <w:t>Software Abstraction and Specification</w:t>
+      </w:r>
+      <w:r>
+        <w:rPr>
+          <w:sz w:val="22"/>
+          <w:szCs w:val="22"/>
+        </w:rPr>
+        <w:t>,</w:t>
+      </w:r>
+      <w:r>
+        <w:rPr>
+          <w:sz w:val="22"/>
+          <w:szCs w:val="22"/>
+        </w:rPr>
+        <w:t xml:space="preserve"> </w:t>
+      </w:r>
+      <w:r>
+        <w:rPr>
+          <w:sz w:val="22"/>
+          <w:szCs w:val="22"/>
+        </w:rPr>
+        <w:t>May</w:t>
+      </w:r>
+      <w:r>
+        <w:rPr>
+          <w:sz w:val="22"/>
+          <w:szCs w:val="22"/>
+        </w:rPr>
+        <w:t xml:space="preserve"> – </w:t>
+      </w:r>
+      <w:r>
+        <w:rPr>
+          <w:sz w:val="22"/>
+          <w:szCs w:val="22"/>
+        </w:rPr>
+        <w:t>August</w:t>
+      </w:r>
+      <w:r>
+        <w:rPr>
+          <w:sz w:val="22"/>
+          <w:szCs w:val="22"/>
+        </w:rPr>
+        <w:t xml:space="preserve"> 2009</w:t>
+      </w:r>
+    </w:p>
+    <w:p>
+      <w:pPr>
+        <w:ind w:left="720"/>
+        <w:rPr>
+          <w:sz w:val="22"/>
+          <w:szCs w:val="22"/>
+        </w:rPr>
+      </w:pPr>
+    </w:p>
+    <w:p>
+      <w:pPr>
+        <w:numPr>
+          <w:ilvl w:val="0"/>
+          <w:numId w:val="1"/>
+        </w:numPr>
+        <w:tabs>
+          <w:tab w:val="clear" w:pos="720"/>
+          <w:tab w:val="num" w:pos="1440"/>
+        </w:tabs>
+        <w:ind w:left="1440"/>
+        <w:rPr>
+          <w:sz w:val="22"/>
+          <w:szCs w:val="22"/>
+        </w:rPr>
+      </w:pPr>
+      <w:r>
+        <w:rPr>
+          <w:sz w:val="22"/>
+          <w:szCs w:val="22"/>
+        </w:rPr>
+        <w:t>Created a fully featured graphical Euchre game</w:t>
+      </w:r>
+    </w:p>
+    <w:p>
+      <w:pPr>
+        <w:numPr>
+          <w:ilvl w:val="0"/>
+          <w:numId w:val="1"/>
+        </w:numPr>
+        <w:tabs>
+          <w:tab w:val="clear" w:pos="720"/>
+          <w:tab w:val="num" w:pos="1440"/>
+        </w:tabs>
+        <w:ind w:left="1440"/>
+        <w:rPr>
+          <w:sz w:val="22"/>
+          <w:szCs w:val="22"/>
+        </w:rPr>
+      </w:pPr>
+      <w:r>
+        <w:rPr>
+          <w:sz w:val="22"/>
+          <w:szCs w:val="22"/>
+        </w:rPr>
+        <w:t>Worked in a group of two, u</w:t>
+      </w:r>
+      <w:r>
+        <w:rPr>
+          <w:sz w:val="22"/>
+          <w:szCs w:val="22"/>
+        </w:rPr>
+        <w:t xml:space="preserve">sing Subversion to organize </w:t>
+      </w:r>
+      <w:r>
+        <w:rPr>
+          <w:sz w:val="22"/>
+          <w:szCs w:val="22"/>
+        </w:rPr>
+        <w:t>code</w:t>
+      </w:r>
+    </w:p>
+    <w:p>
+      <w:pPr>
+        <w:numPr>
+          <w:ilvl w:val="0"/>
+          <w:numId w:val="1"/>
+        </w:numPr>
+        <w:tabs>
+          <w:tab w:val="clear" w:pos="720"/>
+          <w:tab w:val="num" w:pos="1440"/>
+        </w:tabs>
+        <w:ind w:left="1440"/>
+        <w:rPr>
+          <w:sz w:val="22"/>
+          <w:szCs w:val="22"/>
+        </w:rPr>
+      </w:pPr>
+      <w:r>
+        <w:rPr>
+          <w:sz w:val="22"/>
+          <w:szCs w:val="22"/>
+        </w:rPr>
         <w:t xml:space="preserve">Programmed using C++ and </w:t>
       </w:r>
       <w:r>
@@ -2303,7 +2351,6 @@
         </w:rPr>
         <w:t xml:space="preserve">the </w:t>
       </w:r>
-      <w:proofErr w:type="spellStart"/>
       <w:r>
         <w:rPr>
           <w:sz w:val="22"/>
@@ -2311,7 +2358,6 @@
         </w:rPr>
         <w:t>gtkmm</w:t>
       </w:r>
-      <w:proofErr w:type="spellEnd"/>
       <w:r>
         <w:rPr>
           <w:sz w:val="22"/>
@@ -3181,6 +3227,7 @@
   </w:style>
   <w:style w:type="character" w:default="1" w:styleId="DefaultParagraphFont">
     <w:name w:val="Default Paragraph Font"/>
+    <w:semiHidden/>
     <w:unhideWhenUsed/>
   </w:style>
   <w:style w:type="table" w:default="1" w:styleId="TableNormal">

</xml_diff>

<commit_message>
added google (in progress) to word version
</commit_message>
<xml_diff>
--- a/Resume.docx
+++ b/Resume.docx
@@ -92,66 +92,7 @@
               <w:pStyle w:val="Title"/>
               <w:jc w:val="left"/>
               <w:rPr>
-                <w:sz w:val="22"/>
-                <w:szCs w:val="22"/>
-              </w:rPr>
-            </w:pPr>
-            <w:r>
-              <w:rPr>
-                <w:sz w:val="22"/>
-                <w:szCs w:val="22"/>
-              </w:rPr>
-              <w:t>Local Address</w:t>
-            </w:r>
-          </w:p>
-        </w:tc>
-        <w:tc>
-          <w:tcPr>
-            <w:tcW w:w="1504" w:type="pct"/>
-          </w:tcPr>
-          <w:p>
-            <w:pPr>
-              <w:pStyle w:val="Title"/>
-              <w:rPr>
-                <w:sz w:val="22"/>
-                <w:szCs w:val="22"/>
-              </w:rPr>
-            </w:pPr>
-          </w:p>
-        </w:tc>
-        <w:tc>
-          <w:tcPr>
-            <w:tcW w:w="1748" w:type="pct"/>
-          </w:tcPr>
-          <w:p>
-            <w:pPr>
-              <w:pStyle w:val="Title"/>
-              <w:jc w:val="left"/>
-              <w:rPr>
-                <w:sz w:val="22"/>
-                <w:szCs w:val="22"/>
-              </w:rPr>
-            </w:pPr>
-            <w:r>
-              <w:rPr>
-                <w:sz w:val="22"/>
-                <w:szCs w:val="22"/>
-              </w:rPr>
-              <w:t>Permanent Address</w:t>
-            </w:r>
-          </w:p>
-        </w:tc>
-      </w:tr>
-      <w:tr>
-        <w:tc>
-          <w:tcPr>
-            <w:tcW w:w="1748" w:type="pct"/>
-          </w:tcPr>
-          <w:p>
-            <w:pPr>
-              <w:pStyle w:val="Title"/>
-              <w:jc w:val="left"/>
-              <w:rPr>
+                <w:b w:val="0"/>
                 <w:sz w:val="22"/>
                 <w:szCs w:val="22"/>
               </w:rPr>
@@ -162,7 +103,23 @@
                 <w:sz w:val="22"/>
                 <w:szCs w:val="22"/>
               </w:rPr>
-              <w:t>350 Lester Street, Unit 503</w:t>
+              <w:t>197 Zouave Street, Eugenia</w:t>
+            </w:r>
+            <w:r>
+              <w:rPr>
+                <w:b w:val="0"/>
+                <w:sz w:val="22"/>
+                <w:szCs w:val="22"/>
+              </w:rPr>
+              <w:t xml:space="preserve">, </w:t>
+            </w:r>
+            <w:r>
+              <w:rPr>
+                <w:b w:val="0"/>
+                <w:sz w:val="22"/>
+                <w:szCs w:val="22"/>
+              </w:rPr>
+              <w:t>ON</w:t>
             </w:r>
           </w:p>
         </w:tc>
@@ -207,86 +164,7 @@
                 <w:sz w:val="22"/>
                 <w:szCs w:val="22"/>
               </w:rPr>
-              <w:t>197 Zouave Street</w:t>
-            </w:r>
-          </w:p>
-        </w:tc>
-      </w:tr>
-      <w:tr>
-        <w:tc>
-          <w:tcPr>
-            <w:tcW w:w="1748" w:type="pct"/>
-          </w:tcPr>
-          <w:p>
-            <w:pPr>
-              <w:pStyle w:val="Title"/>
-              <w:jc w:val="left"/>
-              <w:rPr>
-                <w:b w:val="0"/>
-                <w:sz w:val="22"/>
-                <w:szCs w:val="22"/>
-              </w:rPr>
-            </w:pPr>
-            <w:r>
-              <w:rPr>
-                <w:b w:val="0"/>
-                <w:sz w:val="22"/>
-                <w:szCs w:val="22"/>
-              </w:rPr>
-              <w:t xml:space="preserve">Waterloo, Ontario, </w:t>
-            </w:r>
-            <w:r>
-              <w:rPr>
-                <w:b w:val="0"/>
-                <w:sz w:val="22"/>
-                <w:szCs w:val="22"/>
-              </w:rPr>
-              <w:t>N2L 3W7</w:t>
-            </w:r>
-          </w:p>
-        </w:tc>
-        <w:tc>
-          <w:tcPr>
-            <w:tcW w:w="1504" w:type="pct"/>
-          </w:tcPr>
-          <w:p>
-            <w:pPr>
-              <w:pStyle w:val="Title"/>
-              <w:rPr>
-                <w:sz w:val="22"/>
-                <w:szCs w:val="22"/>
-              </w:rPr>
-            </w:pPr>
-            <w:r>
-              <w:rPr>
-                <w:b w:val="0"/>
-                <w:sz w:val="22"/>
-                <w:szCs w:val="22"/>
-              </w:rPr>
               <w:t>gjhartma@uwaterloo.ca</w:t>
-            </w:r>
-          </w:p>
-        </w:tc>
-        <w:tc>
-          <w:tcPr>
-            <w:tcW w:w="1748" w:type="pct"/>
-          </w:tcPr>
-          <w:p>
-            <w:pPr>
-              <w:pStyle w:val="Title"/>
-              <w:jc w:val="left"/>
-              <w:rPr>
-                <w:sz w:val="22"/>
-                <w:szCs w:val="22"/>
-              </w:rPr>
-            </w:pPr>
-            <w:r>
-              <w:rPr>
-                <w:b w:val="0"/>
-                <w:sz w:val="22"/>
-                <w:szCs w:val="22"/>
-              </w:rPr>
-              <w:t>Eugenia, Ontario, N0C 1E0</w:t>
             </w:r>
           </w:p>
         </w:tc>
@@ -718,29 +596,7 @@
           <w:szCs w:val="21"/>
           <w:lang w:val="en-US"/>
         </w:rPr>
-        <w:t>Ga</w:t>
-      </w:r>
-      <w:r>
-        <w:rPr>
-          <w:rFonts w:cs="Helvetica"/>
-          <w:b/>
-          <w:color w:val="000000"/>
-          <w:sz w:val="22"/>
-          <w:szCs w:val="21"/>
-          <w:lang w:val="en-US"/>
-        </w:rPr>
-        <w:t>me Portability Developer –</w:t>
-      </w:r>
-      <w:r>
-        <w:rPr>
-          <w:rFonts w:cs="Helvetica"/>
-          <w:b/>
-          <w:color w:val="000000"/>
-          <w:sz w:val="22"/>
-          <w:szCs w:val="21"/>
-          <w:lang w:val="en-US"/>
-        </w:rPr>
-        <w:t xml:space="preserve"> Core R&amp;D</w:t>
+        <w:t>Software Engineering Intern</w:t>
       </w:r>
       <w:r>
         <w:rPr>
@@ -754,24 +610,15 @@
         <w:rPr>
           <w:sz w:val="22"/>
           <w:szCs w:val="22"/>
-          <w:lang w:val="en-US"/>
-        </w:rPr>
-        <w:t>TransGaming T</w:t>
-      </w:r>
-      <w:r>
-        <w:rPr>
-          <w:sz w:val="22"/>
-          <w:szCs w:val="22"/>
-          <w:lang w:val="en-US"/>
-        </w:rPr>
-        <w:t>echnologies Inc</w:t>
-      </w:r>
-      <w:r>
-        <w:rPr>
-          <w:sz w:val="22"/>
-          <w:szCs w:val="22"/>
-        </w:rPr>
-        <w:t>, Toronto, Ontario, January – April 2011</w:t>
+        </w:rPr>
+        <w:t>Google</w:t>
+      </w:r>
+      <w:r>
+        <w:rPr>
+          <w:sz w:val="22"/>
+          <w:szCs w:val="22"/>
+        </w:rPr>
+        <w:t>, Mountain View, California, September 2011 – present</w:t>
       </w:r>
     </w:p>
     <w:p>
@@ -798,21 +645,10 @@
       </w:pPr>
       <w:r>
         <w:rPr>
-          <w:rFonts w:ascii="Times" w:hAnsi="Times"/>
-          <w:sz w:val="22"/>
-          <w:szCs w:val="22"/>
-          <w:lang w:val="en-US"/>
-        </w:rPr>
-        <w:t>Developed strict ANSI C peer-reviewed co</w:t>
-      </w:r>
-      <w:r>
-        <w:rPr>
-          <w:rFonts w:ascii="Times" w:hAnsi="Times"/>
-          <w:sz w:val="22"/>
-          <w:szCs w:val="22"/>
-          <w:lang w:val="en-US"/>
-        </w:rPr>
-        <w:t>de, and reviewed others’ code</w:t>
+          <w:sz w:val="22"/>
+          <w:szCs w:val="22"/>
+        </w:rPr>
+        <w:t xml:space="preserve">Working on the Research team </w:t>
       </w:r>
     </w:p>
     <w:p>
@@ -831,22 +667,103 @@
       </w:pPr>
       <w:r>
         <w:rPr>
-          <w:rFonts w:ascii="Times" w:hAnsi="Times"/>
-          <w:sz w:val="22"/>
-          <w:szCs w:val="22"/>
-          <w:lang w:val="en-US"/>
-        </w:rPr>
-        <w:t>Re-implemented DirectX API func</w:t>
-      </w:r>
-      <w:r>
-        <w:rPr>
-          <w:rFonts w:ascii="Times" w:hAnsi="Times"/>
-          <w:sz w:val="22"/>
-          <w:szCs w:val="22"/>
-          <w:lang w:val="en-US"/>
-        </w:rPr>
-        <w:t>tions for TransGaming’s WineX</w:t>
-      </w:r>
+          <w:sz w:val="22"/>
+          <w:szCs w:val="22"/>
+        </w:rPr>
+        <w:t>Contributing to Video Content Analysis</w:t>
+      </w:r>
+    </w:p>
+    <w:p>
+      <w:pPr>
+        <w:rPr>
+          <w:rFonts w:cs="Helvetica"/>
+          <w:b/>
+          <w:color w:val="000000"/>
+          <w:sz w:val="22"/>
+          <w:szCs w:val="21"/>
+          <w:lang w:val="en-US"/>
+        </w:rPr>
+      </w:pPr>
+    </w:p>
+    <w:p>
+      <w:pPr>
+        <w:rPr>
+          <w:sz w:val="22"/>
+          <w:szCs w:val="22"/>
+        </w:rPr>
+      </w:pPr>
+      <w:r>
+        <w:rPr>
+          <w:rFonts w:cs="Helvetica"/>
+          <w:b/>
+          <w:color w:val="000000"/>
+          <w:sz w:val="22"/>
+          <w:szCs w:val="21"/>
+          <w:lang w:val="en-US"/>
+        </w:rPr>
+        <w:t>Ga</w:t>
+      </w:r>
+      <w:r>
+        <w:rPr>
+          <w:rFonts w:cs="Helvetica"/>
+          <w:b/>
+          <w:color w:val="000000"/>
+          <w:sz w:val="22"/>
+          <w:szCs w:val="21"/>
+          <w:lang w:val="en-US"/>
+        </w:rPr>
+        <w:t>me Portability Developer –</w:t>
+      </w:r>
+      <w:r>
+        <w:rPr>
+          <w:rFonts w:cs="Helvetica"/>
+          <w:b/>
+          <w:color w:val="000000"/>
+          <w:sz w:val="22"/>
+          <w:szCs w:val="21"/>
+          <w:lang w:val="en-US"/>
+        </w:rPr>
+        <w:t xml:space="preserve"> Core R&amp;D</w:t>
+      </w:r>
+      <w:r>
+        <w:rPr>
+          <w:b/>
+          <w:sz w:val="22"/>
+          <w:szCs w:val="22"/>
+        </w:rPr>
+        <w:t xml:space="preserve">, </w:t>
+      </w:r>
+      <w:r>
+        <w:rPr>
+          <w:sz w:val="22"/>
+          <w:szCs w:val="22"/>
+          <w:lang w:val="en-US"/>
+        </w:rPr>
+        <w:t>TransGaming T</w:t>
+      </w:r>
+      <w:r>
+        <w:rPr>
+          <w:sz w:val="22"/>
+          <w:szCs w:val="22"/>
+          <w:lang w:val="en-US"/>
+        </w:rPr>
+        <w:t>echnologies Inc</w:t>
+      </w:r>
+      <w:r>
+        <w:rPr>
+          <w:sz w:val="22"/>
+          <w:szCs w:val="22"/>
+        </w:rPr>
+        <w:t>, Toronto, Ontario, January – April 2011</w:t>
+      </w:r>
+    </w:p>
+    <w:p>
+      <w:pPr>
+        <w:rPr>
+          <w:sz w:val="22"/>
+          <w:szCs w:val="22"/>
+        </w:rPr>
+      </w:pPr>
     </w:p>
     <w:p>
       <w:pPr>
@@ -869,7 +786,7 @@
           <w:szCs w:val="22"/>
           <w:lang w:val="en-US"/>
         </w:rPr>
-        <w:t>Worked responsibly and independently o</w:t>
+        <w:t>Developed strict ANSI C peer-reviewed co</w:t>
       </w:r>
       <w:r>
         <w:rPr>
@@ -878,7 +795,7 @@
           <w:szCs w:val="22"/>
           <w:lang w:val="en-US"/>
         </w:rPr>
-        <w:t>n both Linux and Windows code</w:t>
+        <w:t>de, and reviewed others’ code</w:t>
       </w:r>
     </w:p>
     <w:p>
@@ -902,76 +819,17 @@
           <w:szCs w:val="22"/>
           <w:lang w:val="en-US"/>
         </w:rPr>
-        <w:t>Implemented various 3D Mesh related functions and features</w:t>
-      </w:r>
-    </w:p>
-    <w:p>
-      <w:pPr>
-        <w:rPr>
-          <w:rFonts w:cs="Helvetica"/>
-          <w:b/>
-          <w:color w:val="000000"/>
-          <w:sz w:val="22"/>
-          <w:szCs w:val="21"/>
-          <w:lang w:val="en-US"/>
-        </w:rPr>
-      </w:pPr>
-    </w:p>
-    <w:p>
-      <w:pPr>
-        <w:rPr>
-          <w:sz w:val="22"/>
-          <w:szCs w:val="22"/>
-        </w:rPr>
-      </w:pPr>
-      <w:r>
-        <w:rPr>
-          <w:rFonts w:cs="Helvetica"/>
-          <w:b/>
-          <w:color w:val="000000"/>
-          <w:sz w:val="22"/>
-          <w:szCs w:val="21"/>
-          <w:lang w:val="en-US"/>
-        </w:rPr>
-        <w:t>BlackBerry Internet Service Software Developer</w:t>
-      </w:r>
-      <w:r>
-        <w:rPr>
-          <w:b/>
-          <w:sz w:val="22"/>
-          <w:szCs w:val="22"/>
-        </w:rPr>
-        <w:t xml:space="preserve">, </w:t>
-      </w:r>
-      <w:r>
-        <w:rPr>
-          <w:sz w:val="22"/>
-          <w:szCs w:val="22"/>
-        </w:rPr>
-        <w:t xml:space="preserve">Research In Motion Limited, Waterloo, Ontario, </w:t>
-      </w:r>
-      <w:r>
-        <w:rPr>
-          <w:sz w:val="22"/>
-          <w:szCs w:val="22"/>
-        </w:rPr>
-        <w:t>May</w:t>
-      </w:r>
-      <w:r>
-        <w:rPr>
-          <w:sz w:val="22"/>
-          <w:szCs w:val="22"/>
-        </w:rPr>
-        <w:t xml:space="preserve"> – August 2010</w:t>
-      </w:r>
-    </w:p>
-    <w:p>
-      <w:pPr>
-        <w:rPr>
-          <w:sz w:val="22"/>
-          <w:szCs w:val="22"/>
-        </w:rPr>
-      </w:pPr>
+        <w:t>Re-implemented DirectX API func</w:t>
+      </w:r>
+      <w:r>
+        <w:rPr>
+          <w:rFonts w:ascii="Times" w:hAnsi="Times"/>
+          <w:sz w:val="22"/>
+          <w:szCs w:val="22"/>
+          <w:lang w:val="en-US"/>
+        </w:rPr>
+        <w:t>tions for TransGaming’s WineX</w:t>
+      </w:r>
     </w:p>
     <w:p>
       <w:pPr>
@@ -992,8 +850,18 @@
           <w:rFonts w:ascii="Times" w:hAnsi="Times"/>
           <w:sz w:val="22"/>
           <w:szCs w:val="22"/>
-        </w:rPr>
-        <w:t>Wrote and maintained BlackBerry Internet Service tools in C++</w:t>
+          <w:lang w:val="en-US"/>
+        </w:rPr>
+        <w:t>Worked responsibly and independently o</w:t>
+      </w:r>
+      <w:r>
+        <w:rPr>
+          <w:rFonts w:ascii="Times" w:hAnsi="Times"/>
+          <w:sz w:val="22"/>
+          <w:szCs w:val="22"/>
+          <w:lang w:val="en-US"/>
+        </w:rPr>
+        <w:t>n both Linux and Windows code</w:t>
       </w:r>
     </w:p>
     <w:p>
@@ -1013,12 +881,80 @@
       <w:r>
         <w:rPr>
           <w:rFonts w:ascii="Times" w:hAnsi="Times"/>
-          <w:sz w:val="20"/>
-          <w:szCs w:val="20"/>
-          <w:lang w:val="en-US"/>
-        </w:rPr>
-        <w:t>Developed networking tools using ACE library</w:t>
-      </w:r>
+          <w:sz w:val="22"/>
+          <w:szCs w:val="22"/>
+          <w:lang w:val="en-US"/>
+        </w:rPr>
+        <w:t>Implemented various 3D Mesh related functions and features</w:t>
+      </w:r>
+    </w:p>
+    <w:p>
+      <w:pPr>
+        <w:rPr>
+          <w:rFonts w:cs="Helvetica"/>
+          <w:b/>
+          <w:color w:val="000000"/>
+          <w:sz w:val="22"/>
+          <w:szCs w:val="21"/>
+          <w:lang w:val="en-US"/>
+        </w:rPr>
+      </w:pPr>
+    </w:p>
+    <w:p>
+      <w:pPr>
+        <w:rPr>
+          <w:sz w:val="22"/>
+          <w:szCs w:val="22"/>
+        </w:rPr>
+      </w:pPr>
+      <w:r>
+        <w:rPr>
+          <w:rFonts w:cs="Helvetica"/>
+          <w:b/>
+          <w:color w:val="000000"/>
+          <w:sz w:val="22"/>
+          <w:szCs w:val="21"/>
+          <w:lang w:val="en-US"/>
+        </w:rPr>
+        <w:t>BlackBerry Internet Service Software Developer</w:t>
+      </w:r>
+      <w:r>
+        <w:rPr>
+          <w:b/>
+          <w:sz w:val="22"/>
+          <w:szCs w:val="22"/>
+        </w:rPr>
+        <w:t xml:space="preserve">, </w:t>
+      </w:r>
+      <w:r>
+        <w:rPr>
+          <w:sz w:val="22"/>
+          <w:szCs w:val="22"/>
+        </w:rPr>
+        <w:t xml:space="preserve">Research In Motion Limited, Waterloo, Ontario, </w:t>
+      </w:r>
+      <w:r>
+        <w:rPr>
+          <w:sz w:val="22"/>
+          <w:szCs w:val="22"/>
+        </w:rPr>
+        <w:t>May</w:t>
+      </w:r>
+      <w:r>
+        <w:rPr>
+          <w:sz w:val="22"/>
+          <w:szCs w:val="22"/>
+        </w:rPr>
+        <w:t xml:space="preserve"> – August 2010</w:t>
+      </w:r>
+    </w:p>
+    <w:p>
+      <w:pPr>
+        <w:rPr>
+          <w:sz w:val="22"/>
+          <w:szCs w:val="22"/>
+        </w:rPr>
+      </w:pPr>
     </w:p>
     <w:p>
       <w:pPr>
@@ -1040,7 +976,7 @@
           <w:sz w:val="22"/>
           <w:szCs w:val="22"/>
         </w:rPr>
-        <w:t>Worked extensively on unit testing framework in Python</w:t>
+        <w:t>Wrote and maintained BlackBerry Internet Service tools in C++</w:t>
       </w:r>
     </w:p>
     <w:p>
@@ -1059,110 +995,13 @@
       </w:pPr>
       <w:r>
         <w:rPr>
-          <w:sz w:val="22"/>
-          <w:szCs w:val="22"/>
-        </w:rPr>
-        <w:t>Developed modular, extensible, reusable code</w:t>
-      </w:r>
-    </w:p>
-    <w:p>
-      <w:pPr>
-        <w:rPr>
-          <w:b/>
-          <w:sz w:val="22"/>
-          <w:szCs w:val="22"/>
-        </w:rPr>
-      </w:pPr>
-    </w:p>
-    <w:p>
-      <w:pPr>
-        <w:rPr>
-          <w:sz w:val="22"/>
-          <w:szCs w:val="22"/>
-        </w:rPr>
-      </w:pPr>
-      <w:r>
-        <w:rPr>
-          <w:b/>
-          <w:sz w:val="22"/>
-          <w:szCs w:val="22"/>
-        </w:rPr>
-        <w:t>SlipS</w:t>
-      </w:r>
-      <w:r>
-        <w:rPr>
-          <w:b/>
-          <w:sz w:val="22"/>
-          <w:szCs w:val="22"/>
-        </w:rPr>
-        <w:t xml:space="preserve">tream </w:t>
-      </w:r>
-      <w:r>
-        <w:rPr>
-          <w:b/>
-          <w:sz w:val="22"/>
-          <w:szCs w:val="22"/>
-        </w:rPr>
-        <w:t>Software Test</w:t>
-      </w:r>
-      <w:r>
-        <w:rPr>
-          <w:b/>
-          <w:sz w:val="22"/>
-          <w:szCs w:val="22"/>
-        </w:rPr>
-        <w:t xml:space="preserve">/Tools Developer, </w:t>
-      </w:r>
-      <w:r>
-        <w:rPr>
-          <w:sz w:val="22"/>
-          <w:szCs w:val="22"/>
-        </w:rPr>
-        <w:t>Research In Motion</w:t>
-      </w:r>
-      <w:r>
-        <w:rPr>
-          <w:sz w:val="22"/>
-          <w:szCs w:val="22"/>
-        </w:rPr>
-        <w:t xml:space="preserve"> Limited</w:t>
-      </w:r>
-      <w:r>
-        <w:rPr>
-          <w:sz w:val="22"/>
-          <w:szCs w:val="22"/>
-        </w:rPr>
-        <w:t>, W</w:t>
-      </w:r>
-      <w:r>
-        <w:rPr>
-          <w:sz w:val="22"/>
-          <w:szCs w:val="22"/>
-        </w:rPr>
-        <w:t>aterloo, Ontario, September</w:t>
-      </w:r>
-      <w:r>
-        <w:rPr>
-          <w:sz w:val="22"/>
-          <w:szCs w:val="22"/>
-        </w:rPr>
-        <w:t xml:space="preserve"> – </w:t>
-      </w:r>
-      <w:r>
-        <w:rPr>
-          <w:sz w:val="22"/>
-          <w:szCs w:val="22"/>
-        </w:rPr>
-        <w:t>December 2009</w:t>
-      </w:r>
-    </w:p>
-    <w:p>
-      <w:pPr>
-        <w:rPr>
-          <w:sz w:val="22"/>
-          <w:szCs w:val="22"/>
-        </w:rPr>
-      </w:pPr>
+          <w:rFonts w:ascii="Times" w:hAnsi="Times"/>
+          <w:sz w:val="20"/>
+          <w:szCs w:val="20"/>
+          <w:lang w:val="en-US"/>
+        </w:rPr>
+        <w:t>Developed networking tools using ACE library</w:t>
+      </w:r>
     </w:p>
     <w:p>
       <w:pPr>
@@ -1184,23 +1023,7 @@
           <w:sz w:val="22"/>
           <w:szCs w:val="22"/>
         </w:rPr>
-        <w:t>Perform</w:t>
-      </w:r>
-      <w:r>
-        <w:rPr>
-          <w:rFonts w:ascii="Times" w:hAnsi="Times"/>
-          <w:sz w:val="22"/>
-          <w:szCs w:val="22"/>
-        </w:rPr>
-        <w:t>ed</w:t>
-      </w:r>
-      <w:r>
-        <w:rPr>
-          <w:rFonts w:ascii="Times" w:hAnsi="Times"/>
-          <w:sz w:val="22"/>
-          <w:szCs w:val="22"/>
-        </w:rPr>
-        <w:t xml:space="preserve"> BlackBerry browser performance testing and profiling</w:t>
+        <w:t>Worked extensively on unit testing framework in Python</w:t>
       </w:r>
     </w:p>
     <w:p>
@@ -1219,44 +1042,110 @@
       </w:pPr>
       <w:r>
         <w:rPr>
-          <w:rFonts w:ascii="Times" w:hAnsi="Times"/>
-          <w:sz w:val="22"/>
-          <w:szCs w:val="22"/>
-        </w:rPr>
-        <w:t>Wrote and contributed to testing tools in</w:t>
-      </w:r>
-      <w:r>
-        <w:rPr>
-          <w:rFonts w:ascii="Times" w:hAnsi="Times"/>
-          <w:sz w:val="22"/>
-          <w:szCs w:val="22"/>
-        </w:rPr>
-        <w:t xml:space="preserve"> </w:t>
-      </w:r>
-      <w:r>
-        <w:rPr>
-          <w:rFonts w:ascii="Times" w:hAnsi="Times"/>
-          <w:sz w:val="22"/>
-          <w:szCs w:val="22"/>
-        </w:rPr>
-        <w:t xml:space="preserve">VBA and </w:t>
-      </w:r>
-      <w:r>
-        <w:rPr>
-          <w:rFonts w:ascii="Times" w:hAnsi="Times"/>
-          <w:sz w:val="22"/>
-          <w:szCs w:val="22"/>
-        </w:rPr>
-        <w:t>C++</w:t>
-      </w:r>
-      <w:r>
-        <w:rPr>
-          <w:rFonts w:ascii="Times" w:hAnsi="Times"/>
-          <w:sz w:val="22"/>
-          <w:szCs w:val="22"/>
-        </w:rPr>
-        <w:t>, and provided documentation for said tools</w:t>
-      </w:r>
+          <w:sz w:val="22"/>
+          <w:szCs w:val="22"/>
+        </w:rPr>
+        <w:t>Developed modular, extensible, reusable code</w:t>
+      </w:r>
+    </w:p>
+    <w:p>
+      <w:pPr>
+        <w:rPr>
+          <w:b/>
+          <w:sz w:val="22"/>
+          <w:szCs w:val="22"/>
+        </w:rPr>
+      </w:pPr>
+    </w:p>
+    <w:p>
+      <w:pPr>
+        <w:rPr>
+          <w:sz w:val="22"/>
+          <w:szCs w:val="22"/>
+        </w:rPr>
+      </w:pPr>
+      <w:r>
+        <w:rPr>
+          <w:b/>
+          <w:sz w:val="22"/>
+          <w:szCs w:val="22"/>
+        </w:rPr>
+        <w:t>SlipS</w:t>
+      </w:r>
+      <w:r>
+        <w:rPr>
+          <w:b/>
+          <w:sz w:val="22"/>
+          <w:szCs w:val="22"/>
+        </w:rPr>
+        <w:t xml:space="preserve">tream </w:t>
+      </w:r>
+      <w:r>
+        <w:rPr>
+          <w:b/>
+          <w:sz w:val="22"/>
+          <w:szCs w:val="22"/>
+        </w:rPr>
+        <w:t>Software Test</w:t>
+      </w:r>
+      <w:r>
+        <w:rPr>
+          <w:b/>
+          <w:sz w:val="22"/>
+          <w:szCs w:val="22"/>
+        </w:rPr>
+        <w:t xml:space="preserve">/Tools Developer, </w:t>
+      </w:r>
+      <w:r>
+        <w:rPr>
+          <w:sz w:val="22"/>
+          <w:szCs w:val="22"/>
+        </w:rPr>
+        <w:t>Research In Motion</w:t>
+      </w:r>
+      <w:r>
+        <w:rPr>
+          <w:sz w:val="22"/>
+          <w:szCs w:val="22"/>
+        </w:rPr>
+        <w:t xml:space="preserve"> Limited</w:t>
+      </w:r>
+      <w:r>
+        <w:rPr>
+          <w:sz w:val="22"/>
+          <w:szCs w:val="22"/>
+        </w:rPr>
+        <w:t>, W</w:t>
+      </w:r>
+      <w:r>
+        <w:rPr>
+          <w:sz w:val="22"/>
+          <w:szCs w:val="22"/>
+        </w:rPr>
+        <w:t>aterloo, Ontario, September</w:t>
+      </w:r>
+      <w:r>
+        <w:rPr>
+          <w:sz w:val="22"/>
+          <w:szCs w:val="22"/>
+        </w:rPr>
+        <w:t xml:space="preserve"> – </w:t>
+      </w:r>
+      <w:r>
+        <w:rPr>
+          <w:sz w:val="22"/>
+          <w:szCs w:val="22"/>
+        </w:rPr>
+        <w:t>December 2009</w:t>
+      </w:r>
+    </w:p>
+    <w:p>
+      <w:pPr>
+        <w:rPr>
+          <w:sz w:val="22"/>
+          <w:szCs w:val="22"/>
+        </w:rPr>
+      </w:pPr>
     </w:p>
     <w:p>
       <w:pPr>
@@ -1278,7 +1167,7 @@
           <w:sz w:val="22"/>
           <w:szCs w:val="22"/>
         </w:rPr>
-        <w:t>Test</w:t>
+        <w:t>Perform</w:t>
       </w:r>
       <w:r>
         <w:rPr>
@@ -1294,106 +1183,8 @@
           <w:sz w:val="22"/>
           <w:szCs w:val="22"/>
         </w:rPr>
-        <w:t xml:space="preserve"> various BlackBerry software systems</w:t>
-      </w:r>
-      <w:r>
-        <w:rPr>
-          <w:sz w:val="22"/>
-          <w:szCs w:val="22"/>
-        </w:rPr>
-        <w:t xml:space="preserve"> </w:t>
-      </w:r>
-    </w:p>
-    <w:p>
-      <w:pPr>
-        <w:rPr>
-          <w:b/>
-          <w:sz w:val="22"/>
-          <w:szCs w:val="22"/>
-        </w:rPr>
-      </w:pPr>
-    </w:p>
-    <w:p>
-      <w:pPr>
-        <w:rPr>
-          <w:sz w:val="22"/>
-          <w:szCs w:val="22"/>
-        </w:rPr>
-      </w:pPr>
-      <w:r>
-        <w:rPr>
-          <w:b/>
-          <w:sz w:val="22"/>
-          <w:szCs w:val="22"/>
-        </w:rPr>
-        <w:t>Application Developer</w:t>
-      </w:r>
-      <w:r>
-        <w:rPr>
-          <w:b/>
-          <w:sz w:val="22"/>
-          <w:szCs w:val="22"/>
-        </w:rPr>
-        <w:t xml:space="preserve">, </w:t>
-      </w:r>
-      <w:r>
-        <w:rPr>
-          <w:bCs/>
-          <w:sz w:val="22"/>
-          <w:szCs w:val="22"/>
-        </w:rPr>
-        <w:t>Sun Life Financial</w:t>
-      </w:r>
-      <w:r>
-        <w:rPr>
-          <w:sz w:val="22"/>
-          <w:szCs w:val="22"/>
-        </w:rPr>
-        <w:t xml:space="preserve">, </w:t>
-      </w:r>
-      <w:r>
-        <w:rPr>
-          <w:sz w:val="22"/>
-          <w:szCs w:val="22"/>
-        </w:rPr>
-        <w:t>Waterloo</w:t>
-      </w:r>
-      <w:r>
-        <w:rPr>
-          <w:sz w:val="22"/>
-          <w:szCs w:val="22"/>
-        </w:rPr>
-        <w:t xml:space="preserve">, Ontario, </w:t>
-      </w:r>
-      <w:r>
-        <w:rPr>
-          <w:sz w:val="22"/>
-          <w:szCs w:val="22"/>
-        </w:rPr>
-        <w:t>January</w:t>
-      </w:r>
-      <w:r>
-        <w:rPr>
-          <w:sz w:val="22"/>
-          <w:szCs w:val="22"/>
-        </w:rPr>
-        <w:t xml:space="preserve"> – </w:t>
-      </w:r>
-      <w:r>
-        <w:rPr>
-          <w:sz w:val="22"/>
-          <w:szCs w:val="22"/>
-        </w:rPr>
-        <w:t>April 2009</w:t>
-      </w:r>
-    </w:p>
-    <w:p>
-      <w:pPr>
-        <w:rPr>
-          <w:sz w:val="22"/>
-          <w:szCs w:val="22"/>
-        </w:rPr>
-      </w:pPr>
+        <w:t xml:space="preserve"> BlackBerry browser performance testing and profiling</w:t>
+      </w:r>
     </w:p>
     <w:p>
       <w:pPr>
@@ -1401,52 +1192,53 @@
           <w:ilvl w:val="0"/>
           <w:numId w:val="1"/>
         </w:numPr>
-        <w:rPr>
-          <w:sz w:val="22"/>
-          <w:szCs w:val="22"/>
-        </w:rPr>
-      </w:pPr>
-      <w:r>
-        <w:rPr>
-          <w:sz w:val="22"/>
-          <w:szCs w:val="22"/>
-        </w:rPr>
-        <w:t xml:space="preserve">Developed functionality for the company intranet portal using </w:t>
-      </w:r>
-      <w:r>
-        <w:rPr>
-          <w:sz w:val="22"/>
-          <w:szCs w:val="22"/>
-        </w:rPr>
-        <w:t>ASP</w:t>
-      </w:r>
-      <w:r>
-        <w:rPr>
-          <w:sz w:val="22"/>
-          <w:szCs w:val="22"/>
-        </w:rPr>
-        <w:t>.</w:t>
-      </w:r>
-      <w:r>
-        <w:rPr>
-          <w:sz w:val="22"/>
-          <w:szCs w:val="22"/>
-        </w:rPr>
-        <w:t>NET</w:t>
-      </w:r>
-      <w:r>
-        <w:rPr>
-          <w:sz w:val="22"/>
-          <w:szCs w:val="22"/>
-        </w:rPr>
-        <w:t>,</w:t>
-      </w:r>
-      <w:r>
-        <w:rPr>
-          <w:sz w:val="22"/>
-          <w:szCs w:val="22"/>
-        </w:rPr>
-        <w:t xml:space="preserve"> C# and Ajax</w:t>
+        <w:spacing w:beforeLines="1" w:afterLines="1"/>
+        <w:rPr>
+          <w:rFonts w:ascii="Times" w:hAnsi="Times"/>
+          <w:sz w:val="20"/>
+          <w:szCs w:val="20"/>
+          <w:lang w:val="en-US"/>
+        </w:rPr>
+      </w:pPr>
+      <w:r>
+        <w:rPr>
+          <w:rFonts w:ascii="Times" w:hAnsi="Times"/>
+          <w:sz w:val="22"/>
+          <w:szCs w:val="22"/>
+        </w:rPr>
+        <w:t>Wrote and contributed to testing tools in</w:t>
+      </w:r>
+      <w:r>
+        <w:rPr>
+          <w:rFonts w:ascii="Times" w:hAnsi="Times"/>
+          <w:sz w:val="22"/>
+          <w:szCs w:val="22"/>
+        </w:rPr>
+        <w:t xml:space="preserve"> </w:t>
+      </w:r>
+      <w:r>
+        <w:rPr>
+          <w:rFonts w:ascii="Times" w:hAnsi="Times"/>
+          <w:sz w:val="22"/>
+          <w:szCs w:val="22"/>
+        </w:rPr>
+        <w:t xml:space="preserve">VBA and </w:t>
+      </w:r>
+      <w:r>
+        <w:rPr>
+          <w:rFonts w:ascii="Times" w:hAnsi="Times"/>
+          <w:sz w:val="22"/>
+          <w:szCs w:val="22"/>
+        </w:rPr>
+        <w:t>C++</w:t>
+      </w:r>
+      <w:r>
+        <w:rPr>
+          <w:rFonts w:ascii="Times" w:hAnsi="Times"/>
+          <w:sz w:val="22"/>
+          <w:szCs w:val="22"/>
+        </w:rPr>
+        <w:t>, and provided documentation for said tools</w:t>
       </w:r>
     </w:p>
     <w:p>
@@ -1455,18 +1247,136 @@
           <w:ilvl w:val="0"/>
           <w:numId w:val="1"/>
         </w:numPr>
-        <w:rPr>
-          <w:sz w:val="22"/>
-          <w:szCs w:val="22"/>
-        </w:rPr>
-      </w:pPr>
-      <w:r>
-        <w:rPr>
-          <w:sz w:val="22"/>
-          <w:szCs w:val="22"/>
-        </w:rPr>
-        <w:t>Created dynamic and branded web sites using JavaScript and CSS</w:t>
-      </w:r>
+        <w:spacing w:beforeLines="1" w:afterLines="1"/>
+        <w:rPr>
+          <w:rFonts w:ascii="Times" w:hAnsi="Times"/>
+          <w:sz w:val="20"/>
+          <w:szCs w:val="20"/>
+          <w:lang w:val="en-US"/>
+        </w:rPr>
+      </w:pPr>
+      <w:r>
+        <w:rPr>
+          <w:rFonts w:ascii="Times" w:hAnsi="Times"/>
+          <w:sz w:val="22"/>
+          <w:szCs w:val="22"/>
+        </w:rPr>
+        <w:t>Test</w:t>
+      </w:r>
+      <w:r>
+        <w:rPr>
+          <w:rFonts w:ascii="Times" w:hAnsi="Times"/>
+          <w:sz w:val="22"/>
+          <w:szCs w:val="22"/>
+        </w:rPr>
+        <w:t>ed</w:t>
+      </w:r>
+      <w:r>
+        <w:rPr>
+          <w:rFonts w:ascii="Times" w:hAnsi="Times"/>
+          <w:sz w:val="22"/>
+          <w:szCs w:val="22"/>
+        </w:rPr>
+        <w:t xml:space="preserve"> various BlackBerry software systems</w:t>
+      </w:r>
+      <w:r>
+        <w:rPr>
+          <w:sz w:val="22"/>
+          <w:szCs w:val="22"/>
+        </w:rPr>
+        <w:t xml:space="preserve"> </w:t>
+      </w:r>
+    </w:p>
+    <w:p>
+      <w:pPr>
+        <w:rPr>
+          <w:b/>
+          <w:sz w:val="22"/>
+          <w:szCs w:val="22"/>
+        </w:rPr>
+      </w:pPr>
+    </w:p>
+    <w:p>
+      <w:pPr>
+        <w:rPr>
+          <w:sz w:val="22"/>
+          <w:szCs w:val="22"/>
+        </w:rPr>
+      </w:pPr>
+      <w:r>
+        <w:rPr>
+          <w:b/>
+          <w:sz w:val="22"/>
+          <w:szCs w:val="22"/>
+        </w:rPr>
+        <w:t>Application Developer</w:t>
+      </w:r>
+      <w:r>
+        <w:rPr>
+          <w:b/>
+          <w:sz w:val="22"/>
+          <w:szCs w:val="22"/>
+        </w:rPr>
+        <w:t xml:space="preserve">, </w:t>
+      </w:r>
+      <w:r>
+        <w:rPr>
+          <w:bCs/>
+          <w:sz w:val="22"/>
+          <w:szCs w:val="22"/>
+        </w:rPr>
+        <w:t>Sun Life Financial</w:t>
+      </w:r>
+      <w:r>
+        <w:rPr>
+          <w:sz w:val="22"/>
+          <w:szCs w:val="22"/>
+        </w:rPr>
+        <w:t xml:space="preserve">, </w:t>
+      </w:r>
+      <w:r>
+        <w:rPr>
+          <w:sz w:val="22"/>
+          <w:szCs w:val="22"/>
+        </w:rPr>
+        <w:t>Waterloo</w:t>
+      </w:r>
+      <w:r>
+        <w:rPr>
+          <w:sz w:val="22"/>
+          <w:szCs w:val="22"/>
+        </w:rPr>
+        <w:t xml:space="preserve">, Ontario, </w:t>
+      </w:r>
+      <w:r>
+        <w:rPr>
+          <w:sz w:val="22"/>
+          <w:szCs w:val="22"/>
+        </w:rPr>
+        <w:t>January</w:t>
+      </w:r>
+      <w:r>
+        <w:rPr>
+          <w:sz w:val="22"/>
+          <w:szCs w:val="22"/>
+        </w:rPr>
+        <w:t xml:space="preserve"> – </w:t>
+      </w:r>
+      <w:r>
+        <w:rPr>
+          <w:sz w:val="22"/>
+          <w:szCs w:val="22"/>
+        </w:rPr>
+        <w:t>April 2009</w:t>
+      </w:r>
+    </w:p>
+    <w:p>
+      <w:pPr>
+        <w:rPr>
+          <w:sz w:val="22"/>
+          <w:szCs w:val="22"/>
+        </w:rPr>
+      </w:pPr>
     </w:p>
     <w:p>
       <w:pPr>
@@ -1484,99 +1394,43 @@
           <w:sz w:val="22"/>
           <w:szCs w:val="22"/>
         </w:rPr>
-        <w:t>Handled daily issues reported to the Website Support Inbox</w:t>
-      </w:r>
-    </w:p>
-    <w:p>
-      <w:pPr>
-        <w:rPr>
-          <w:b/>
-          <w:sz w:val="22"/>
-          <w:szCs w:val="22"/>
-        </w:rPr>
-      </w:pPr>
-    </w:p>
-    <w:p>
-      <w:pPr>
-        <w:rPr>
-          <w:sz w:val="22"/>
-          <w:szCs w:val="22"/>
-        </w:rPr>
-      </w:pPr>
-      <w:r>
-        <w:rPr>
-          <w:b/>
-          <w:sz w:val="22"/>
-          <w:szCs w:val="22"/>
-        </w:rPr>
-        <w:t>Test Specialist</w:t>
-      </w:r>
-      <w:r>
-        <w:rPr>
-          <w:b/>
-          <w:sz w:val="22"/>
-          <w:szCs w:val="22"/>
-        </w:rPr>
-        <w:t xml:space="preserve">, </w:t>
-      </w:r>
-      <w:r>
-        <w:rPr>
-          <w:bCs/>
-          <w:sz w:val="22"/>
-          <w:szCs w:val="22"/>
-        </w:rPr>
-        <w:t>Agfa Healthcare</w:t>
-      </w:r>
-      <w:r>
-        <w:rPr>
-          <w:sz w:val="22"/>
-          <w:szCs w:val="22"/>
-        </w:rPr>
-        <w:t xml:space="preserve">, </w:t>
-      </w:r>
-      <w:r>
-        <w:rPr>
-          <w:sz w:val="22"/>
-          <w:szCs w:val="22"/>
-        </w:rPr>
-        <w:t>Waterloo</w:t>
-      </w:r>
-      <w:r>
-        <w:rPr>
-          <w:sz w:val="22"/>
-          <w:szCs w:val="22"/>
-        </w:rPr>
-        <w:t xml:space="preserve">, Ontario, </w:t>
-      </w:r>
-      <w:r>
-        <w:rPr>
-          <w:sz w:val="22"/>
-          <w:szCs w:val="22"/>
-        </w:rPr>
-        <w:t>May</w:t>
-      </w:r>
-      <w:r>
-        <w:rPr>
-          <w:sz w:val="22"/>
-          <w:szCs w:val="22"/>
-        </w:rPr>
-        <w:t xml:space="preserve"> – </w:t>
-      </w:r>
-      <w:r>
-        <w:rPr>
-          <w:sz w:val="22"/>
-          <w:szCs w:val="22"/>
-        </w:rPr>
-        <w:t>August 2008</w:t>
-      </w:r>
-    </w:p>
-    <w:p>
-      <w:pPr>
-        <w:rPr>
-          <w:sz w:val="22"/>
-          <w:szCs w:val="22"/>
-        </w:rPr>
-      </w:pPr>
+        <w:t xml:space="preserve">Developed functionality for the company intranet portal using </w:t>
+      </w:r>
+      <w:r>
+        <w:rPr>
+          <w:sz w:val="22"/>
+          <w:szCs w:val="22"/>
+        </w:rPr>
+        <w:t>ASP</w:t>
+      </w:r>
+      <w:r>
+        <w:rPr>
+          <w:sz w:val="22"/>
+          <w:szCs w:val="22"/>
+        </w:rPr>
+        <w:t>.</w:t>
+      </w:r>
+      <w:r>
+        <w:rPr>
+          <w:sz w:val="22"/>
+          <w:szCs w:val="22"/>
+        </w:rPr>
+        <w:t>NET</w:t>
+      </w:r>
+      <w:r>
+        <w:rPr>
+          <w:sz w:val="22"/>
+          <w:szCs w:val="22"/>
+        </w:rPr>
+        <w:t>,</w:t>
+      </w:r>
+      <w:r>
+        <w:rPr>
+          <w:sz w:val="22"/>
+          <w:szCs w:val="22"/>
+        </w:rPr>
+        <w:t xml:space="preserve"> C# and Ajax</w:t>
+      </w:r>
     </w:p>
     <w:p>
       <w:pPr>
@@ -1593,25 +1447,8 @@
         <w:rPr>
           <w:sz w:val="22"/>
           <w:szCs w:val="22"/>
-          <w:lang w:val="en-US"/>
-        </w:rPr>
-        <w:t>Design</w:t>
-      </w:r>
-      <w:r>
-        <w:rPr>
-          <w:sz w:val="22"/>
-          <w:szCs w:val="22"/>
-          <w:lang w:val="en-US"/>
-        </w:rPr>
-        <w:t>ed and developed</w:t>
-      </w:r>
-      <w:r>
-        <w:rPr>
-          <w:sz w:val="22"/>
-          <w:szCs w:val="22"/>
-          <w:lang w:val="en-US"/>
-        </w:rPr>
-        <w:t xml:space="preserve"> automated test procedures</w:t>
+        </w:rPr>
+        <w:t>Created dynamic and branded web sites using JavaScript and CSS</w:t>
       </w:r>
     </w:p>
     <w:p>
@@ -1629,34 +1466,100 @@
         <w:rPr>
           <w:sz w:val="22"/>
           <w:szCs w:val="22"/>
-          <w:lang w:val="en-US"/>
-        </w:rPr>
-        <w:t>Created</w:t>
-      </w:r>
-      <w:r>
-        <w:rPr>
-          <w:sz w:val="22"/>
-          <w:szCs w:val="22"/>
-          <w:lang w:val="en-US"/>
-        </w:rPr>
-        <w:t xml:space="preserve"> execute</w:t>
-      </w:r>
-      <w:r>
-        <w:rPr>
-          <w:sz w:val="22"/>
-          <w:szCs w:val="22"/>
-          <w:lang w:val="en-US"/>
-        </w:rPr>
-        <w:t>d</w:t>
-      </w:r>
-      <w:r>
-        <w:rPr>
-          <w:sz w:val="22"/>
-          <w:szCs w:val="22"/>
-          <w:lang w:val="en-US"/>
-        </w:rPr>
-        <w:t xml:space="preserve"> reusable and maintainable automated scripts</w:t>
-      </w:r>
+        </w:rPr>
+        <w:t>Handled daily issues reported to the Website Support Inbox</w:t>
+      </w:r>
+    </w:p>
+    <w:p>
+      <w:pPr>
+        <w:rPr>
+          <w:b/>
+          <w:sz w:val="22"/>
+          <w:szCs w:val="22"/>
+        </w:rPr>
+      </w:pPr>
+    </w:p>
+    <w:p>
+      <w:pPr>
+        <w:rPr>
+          <w:sz w:val="22"/>
+          <w:szCs w:val="22"/>
+        </w:rPr>
+      </w:pPr>
+      <w:r>
+        <w:rPr>
+          <w:b/>
+          <w:sz w:val="22"/>
+          <w:szCs w:val="22"/>
+        </w:rPr>
+        <w:t>Test Specialist</w:t>
+      </w:r>
+      <w:r>
+        <w:rPr>
+          <w:b/>
+          <w:sz w:val="22"/>
+          <w:szCs w:val="22"/>
+        </w:rPr>
+        <w:t xml:space="preserve">, </w:t>
+      </w:r>
+      <w:r>
+        <w:rPr>
+          <w:bCs/>
+          <w:sz w:val="22"/>
+          <w:szCs w:val="22"/>
+        </w:rPr>
+        <w:t>Agfa Healthcare</w:t>
+      </w:r>
+      <w:r>
+        <w:rPr>
+          <w:sz w:val="22"/>
+          <w:szCs w:val="22"/>
+        </w:rPr>
+        <w:t xml:space="preserve">, </w:t>
+      </w:r>
+      <w:r>
+        <w:rPr>
+          <w:sz w:val="22"/>
+          <w:szCs w:val="22"/>
+        </w:rPr>
+        <w:t>Waterloo</w:t>
+      </w:r>
+      <w:r>
+        <w:rPr>
+          <w:sz w:val="22"/>
+          <w:szCs w:val="22"/>
+        </w:rPr>
+        <w:t xml:space="preserve">, Ontario, </w:t>
+      </w:r>
+      <w:r>
+        <w:rPr>
+          <w:sz w:val="22"/>
+          <w:szCs w:val="22"/>
+        </w:rPr>
+        <w:t>May</w:t>
+      </w:r>
+      <w:r>
+        <w:rPr>
+          <w:sz w:val="22"/>
+          <w:szCs w:val="22"/>
+        </w:rPr>
+        <w:t xml:space="preserve"> – </w:t>
+      </w:r>
+      <w:r>
+        <w:rPr>
+          <w:sz w:val="22"/>
+          <w:szCs w:val="22"/>
+        </w:rPr>
+        <w:t>August 2008</w:t>
+      </w:r>
+    </w:p>
+    <w:p>
+      <w:pPr>
+        <w:rPr>
+          <w:sz w:val="22"/>
+          <w:szCs w:val="22"/>
+        </w:rPr>
+      </w:pPr>
     </w:p>
     <w:p>
       <w:pPr>
@@ -1675,229 +1578,24 @@
           <w:szCs w:val="22"/>
           <w:lang w:val="en-US"/>
         </w:rPr>
-        <w:t>Follow</w:t>
-      </w:r>
-      <w:r>
-        <w:rPr>
-          <w:sz w:val="22"/>
-          <w:szCs w:val="22"/>
-          <w:lang w:val="en-US"/>
-        </w:rPr>
-        <w:t>ed</w:t>
-      </w:r>
-      <w:r>
-        <w:rPr>
-          <w:sz w:val="22"/>
-          <w:szCs w:val="22"/>
-          <w:lang w:val="en-US"/>
-        </w:rPr>
-        <w:t xml:space="preserve"> development and testing standards and guidelines</w:t>
-      </w:r>
-    </w:p>
-    <w:p>
-      <w:pPr>
-        <w:ind w:left="360"/>
-        <w:rPr>
-          <w:sz w:val="22"/>
-          <w:szCs w:val="22"/>
-        </w:rPr>
-      </w:pPr>
-    </w:p>
-    <w:p>
-      <w:pPr>
-        <w:ind w:left="360"/>
-        <w:rPr>
-          <w:sz w:val="22"/>
-          <w:szCs w:val="22"/>
-        </w:rPr>
-      </w:pPr>
-    </w:p>
-    <w:p>
-      <w:pPr>
-        <w:ind w:left="360"/>
-        <w:rPr>
-          <w:sz w:val="22"/>
-          <w:szCs w:val="22"/>
-        </w:rPr>
-      </w:pPr>
-    </w:p>
-    <w:p>
-      <w:pPr>
-        <w:pStyle w:val="Heading3"/>
-        <w:spacing w:after="0"/>
-        <w:rPr>
-          <w:rFonts w:ascii="Times New Roman" w:hAnsi="Times New Roman" w:cs="Times New Roman"/>
-          <w:b w:val="0"/>
-          <w:sz w:val="22"/>
-          <w:szCs w:val="22"/>
-        </w:rPr>
-      </w:pPr>
-      <w:r>
-        <w:rPr>
-          <w:rFonts w:ascii="Times New Roman" w:hAnsi="Times New Roman" w:cs="Times New Roman"/>
-          <w:sz w:val="22"/>
-          <w:szCs w:val="22"/>
-        </w:rPr>
-        <w:t>EDUCATION</w:t>
-      </w:r>
-    </w:p>
-    <w:p>
-      <w:pPr>
-        <w:rPr>
-          <w:sz w:val="22"/>
-          <w:szCs w:val="22"/>
-        </w:rPr>
-      </w:pPr>
-    </w:p>
-    <w:p>
-      <w:pPr>
-        <w:pStyle w:val="Footer"/>
-        <w:tabs>
-          <w:tab w:val="clear" w:pos="4320"/>
-          <w:tab w:val="clear" w:pos="8640"/>
-        </w:tabs>
-        <w:rPr>
-          <w:szCs w:val="22"/>
-        </w:rPr>
-      </w:pPr>
-      <w:bookmarkStart w:id="2" w:name="OLE_LINK8"/>
-      <w:r>
-        <w:rPr>
-          <w:b/>
-          <w:szCs w:val="22"/>
-        </w:rPr>
-        <w:t>Candidate for Bachelor of Computer Science</w:t>
-      </w:r>
-      <w:r>
-        <w:rPr>
-          <w:szCs w:val="22"/>
-        </w:rPr>
-        <w:t>, Computer Science, Co-op Program, University of Waterloo, Wa</w:t>
-      </w:r>
-      <w:r>
-        <w:rPr>
-          <w:szCs w:val="22"/>
-        </w:rPr>
-        <w:t>terloo, Ontario, September 2007 –</w:t>
-      </w:r>
-      <w:r>
-        <w:rPr>
-          <w:szCs w:val="22"/>
-        </w:rPr>
-        <w:t xml:space="preserve"> present</w:t>
-      </w:r>
-    </w:p>
-    <w:p>
-      <w:pPr>
-        <w:pStyle w:val="Footer"/>
-        <w:tabs>
-          <w:tab w:val="clear" w:pos="4320"/>
-          <w:tab w:val="clear" w:pos="8640"/>
-          <w:tab w:val="right" w:pos="9360"/>
-        </w:tabs>
-        <w:rPr>
-          <w:szCs w:val="22"/>
-        </w:rPr>
-      </w:pPr>
-      <w:bookmarkStart w:id="3" w:name="OLE_LINK9"/>
-      <w:bookmarkEnd w:id="2"/>
-    </w:p>
-    <w:p>
-      <w:pPr>
-        <w:pStyle w:val="Footer"/>
-        <w:tabs>
-          <w:tab w:val="clear" w:pos="4320"/>
-          <w:tab w:val="clear" w:pos="8640"/>
-          <w:tab w:val="right" w:pos="9360"/>
-        </w:tabs>
-        <w:ind w:left="720"/>
-        <w:rPr>
-          <w:b/>
-          <w:bCs/>
-          <w:szCs w:val="22"/>
-        </w:rPr>
-      </w:pPr>
-      <w:r>
-        <w:rPr>
-          <w:b/>
-          <w:bCs/>
-          <w:szCs w:val="22"/>
-        </w:rPr>
-        <w:t>Relevant Assignments:</w:t>
-      </w:r>
-    </w:p>
-    <w:p>
-      <w:pPr>
-        <w:pStyle w:val="Footer"/>
-        <w:tabs>
-          <w:tab w:val="clear" w:pos="4320"/>
-          <w:tab w:val="clear" w:pos="8640"/>
-          <w:tab w:val="right" w:pos="9360"/>
-        </w:tabs>
-        <w:ind w:left="720"/>
-        <w:rPr>
-          <w:b/>
-          <w:bCs/>
-          <w:szCs w:val="22"/>
-        </w:rPr>
-      </w:pPr>
-    </w:p>
-    <w:p>
-      <w:pPr>
-        <w:ind w:left="720"/>
-        <w:rPr>
-          <w:sz w:val="22"/>
-          <w:szCs w:val="22"/>
-        </w:rPr>
-      </w:pPr>
-      <w:r>
-        <w:rPr>
-          <w:b/>
-          <w:bCs/>
-          <w:sz w:val="22"/>
-          <w:szCs w:val="22"/>
-        </w:rPr>
-        <w:t>Genetic Algorithm (In Progress)</w:t>
-      </w:r>
-      <w:r>
-        <w:rPr>
-          <w:b/>
-          <w:bCs/>
-          <w:sz w:val="22"/>
-          <w:szCs w:val="22"/>
-        </w:rPr>
-        <w:t xml:space="preserve">, </w:t>
-      </w:r>
-      <w:r>
-        <w:rPr>
-          <w:sz w:val="22"/>
-          <w:szCs w:val="22"/>
-        </w:rPr>
-        <w:t>Artificial Intelligence,</w:t>
-      </w:r>
-      <w:r>
-        <w:rPr>
-          <w:sz w:val="22"/>
-          <w:szCs w:val="22"/>
-        </w:rPr>
-        <w:t xml:space="preserve"> </w:t>
-      </w:r>
-      <w:r>
-        <w:rPr>
-          <w:sz w:val="22"/>
-          <w:szCs w:val="22"/>
-        </w:rPr>
-        <w:t>May – August 2011</w:t>
-      </w:r>
-    </w:p>
-    <w:p>
-      <w:pPr>
-        <w:ind w:left="720"/>
-        <w:rPr>
-          <w:sz w:val="22"/>
-          <w:szCs w:val="22"/>
-        </w:rPr>
-      </w:pPr>
+        <w:t>Design</w:t>
+      </w:r>
+      <w:r>
+        <w:rPr>
+          <w:sz w:val="22"/>
+          <w:szCs w:val="22"/>
+          <w:lang w:val="en-US"/>
+        </w:rPr>
+        <w:t>ed and developed</w:t>
+      </w:r>
+      <w:r>
+        <w:rPr>
+          <w:sz w:val="22"/>
+          <w:szCs w:val="22"/>
+          <w:lang w:val="en-US"/>
+        </w:rPr>
+        <w:t xml:space="preserve"> automated test procedures</w:t>
+      </w:r>
     </w:p>
     <w:p>
       <w:pPr>
@@ -1905,23 +1603,42 @@
           <w:ilvl w:val="0"/>
           <w:numId w:val="1"/>
         </w:numPr>
-        <w:tabs>
-          <w:tab w:val="clear" w:pos="720"/>
-          <w:tab w:val="num" w:pos="1440"/>
-        </w:tabs>
-        <w:ind w:left="1440"/>
-        <w:rPr>
-          <w:sz w:val="22"/>
-          <w:szCs w:val="22"/>
-        </w:rPr>
-      </w:pPr>
-      <w:r>
-        <w:rPr>
-          <w:sz w:val="22"/>
-          <w:szCs w:val="22"/>
-          <w:lang w:val="en-US"/>
-        </w:rPr>
-        <w:t>Implementing a solution to the Wordsnakes game</w:t>
+        <w:rPr>
+          <w:sz w:val="22"/>
+          <w:szCs w:val="22"/>
+        </w:rPr>
+      </w:pPr>
+      <w:r>
+        <w:rPr>
+          <w:sz w:val="22"/>
+          <w:szCs w:val="22"/>
+          <w:lang w:val="en-US"/>
+        </w:rPr>
+        <w:t>Created</w:t>
+      </w:r>
+      <w:r>
+        <w:rPr>
+          <w:sz w:val="22"/>
+          <w:szCs w:val="22"/>
+          <w:lang w:val="en-US"/>
+        </w:rPr>
+        <w:t xml:space="preserve"> execute</w:t>
+      </w:r>
+      <w:r>
+        <w:rPr>
+          <w:sz w:val="22"/>
+          <w:szCs w:val="22"/>
+          <w:lang w:val="en-US"/>
+        </w:rPr>
+        <w:t>d</w:t>
+      </w:r>
+      <w:r>
+        <w:rPr>
+          <w:sz w:val="22"/>
+          <w:szCs w:val="22"/>
+          <w:lang w:val="en-US"/>
+        </w:rPr>
+        <w:t xml:space="preserve"> reusable and maintainable automated scripts</w:t>
       </w:r>
     </w:p>
     <w:p>
@@ -1930,12 +1647,292 @@
           <w:ilvl w:val="0"/>
           <w:numId w:val="1"/>
         </w:numPr>
+        <w:rPr>
+          <w:sz w:val="22"/>
+          <w:szCs w:val="22"/>
+        </w:rPr>
+      </w:pPr>
+      <w:r>
+        <w:rPr>
+          <w:sz w:val="22"/>
+          <w:szCs w:val="22"/>
+          <w:lang w:val="en-US"/>
+        </w:rPr>
+        <w:t>Follow</w:t>
+      </w:r>
+      <w:r>
+        <w:rPr>
+          <w:sz w:val="22"/>
+          <w:szCs w:val="22"/>
+          <w:lang w:val="en-US"/>
+        </w:rPr>
+        <w:t>ed</w:t>
+      </w:r>
+      <w:r>
+        <w:rPr>
+          <w:sz w:val="22"/>
+          <w:szCs w:val="22"/>
+          <w:lang w:val="en-US"/>
+        </w:rPr>
+        <w:t xml:space="preserve"> development and testing standards and guidelines</w:t>
+      </w:r>
+    </w:p>
+    <w:p>
+      <w:pPr>
+        <w:ind w:left="360"/>
+        <w:rPr>
+          <w:sz w:val="22"/>
+          <w:szCs w:val="22"/>
+        </w:rPr>
+      </w:pPr>
+    </w:p>
+    <w:p>
+      <w:pPr>
+        <w:ind w:left="360"/>
+        <w:rPr>
+          <w:sz w:val="22"/>
+          <w:szCs w:val="22"/>
+        </w:rPr>
+      </w:pPr>
+    </w:p>
+    <w:p>
+      <w:pPr>
+        <w:ind w:left="360"/>
+        <w:rPr>
+          <w:sz w:val="22"/>
+          <w:szCs w:val="22"/>
+        </w:rPr>
+      </w:pPr>
+    </w:p>
+    <w:p>
+      <w:pPr>
+        <w:pStyle w:val="Heading3"/>
+        <w:spacing w:after="0"/>
+        <w:rPr>
+          <w:rFonts w:ascii="Times New Roman" w:hAnsi="Times New Roman" w:cs="Times New Roman"/>
+          <w:b w:val="0"/>
+          <w:sz w:val="22"/>
+          <w:szCs w:val="22"/>
+        </w:rPr>
+      </w:pPr>
+      <w:r>
+        <w:rPr>
+          <w:rFonts w:ascii="Times New Roman" w:hAnsi="Times New Roman" w:cs="Times New Roman"/>
+          <w:sz w:val="22"/>
+          <w:szCs w:val="22"/>
+        </w:rPr>
+        <w:t>EDUCATION</w:t>
+      </w:r>
+    </w:p>
+    <w:p>
+      <w:pPr>
+        <w:rPr>
+          <w:sz w:val="22"/>
+          <w:szCs w:val="22"/>
+        </w:rPr>
+      </w:pPr>
+    </w:p>
+    <w:p>
+      <w:pPr>
+        <w:pStyle w:val="Footer"/>
+        <w:tabs>
+          <w:tab w:val="clear" w:pos="4320"/>
+          <w:tab w:val="clear" w:pos="8640"/>
+        </w:tabs>
+        <w:rPr>
+          <w:szCs w:val="22"/>
+        </w:rPr>
+      </w:pPr>
+      <w:bookmarkStart w:id="2" w:name="OLE_LINK8"/>
+      <w:r>
+        <w:rPr>
+          <w:b/>
+          <w:szCs w:val="22"/>
+        </w:rPr>
+        <w:t>Candidate for Bachelor of Computer Science</w:t>
+      </w:r>
+      <w:r>
+        <w:rPr>
+          <w:szCs w:val="22"/>
+        </w:rPr>
+        <w:t>, Computer Science, Co-op Program, University of Waterloo, Wa</w:t>
+      </w:r>
+      <w:r>
+        <w:rPr>
+          <w:szCs w:val="22"/>
+        </w:rPr>
+        <w:t>terloo, Ontario, September 2007 –</w:t>
+      </w:r>
+      <w:r>
+        <w:rPr>
+          <w:szCs w:val="22"/>
+        </w:rPr>
+        <w:t xml:space="preserve"> </w:t>
+      </w:r>
+      <w:r>
+        <w:rPr>
+          <w:szCs w:val="22"/>
+        </w:rPr>
+        <w:t>April 2012</w:t>
+      </w:r>
+    </w:p>
+    <w:p>
+      <w:pPr>
+        <w:pStyle w:val="Footer"/>
+        <w:tabs>
+          <w:tab w:val="clear" w:pos="4320"/>
+          <w:tab w:val="clear" w:pos="8640"/>
+          <w:tab w:val="right" w:pos="9360"/>
+        </w:tabs>
+        <w:rPr>
+          <w:szCs w:val="22"/>
+        </w:rPr>
+      </w:pPr>
+      <w:bookmarkStart w:id="3" w:name="OLE_LINK9"/>
+      <w:bookmarkEnd w:id="2"/>
+    </w:p>
+    <w:p>
+      <w:pPr>
+        <w:pStyle w:val="Footer"/>
+        <w:tabs>
+          <w:tab w:val="clear" w:pos="4320"/>
+          <w:tab w:val="clear" w:pos="8640"/>
+          <w:tab w:val="right" w:pos="9360"/>
+        </w:tabs>
+        <w:ind w:left="720"/>
+        <w:rPr>
+          <w:b/>
+          <w:bCs/>
+          <w:szCs w:val="22"/>
+        </w:rPr>
+      </w:pPr>
+      <w:r>
+        <w:rPr>
+          <w:b/>
+          <w:bCs/>
+          <w:szCs w:val="22"/>
+        </w:rPr>
+        <w:t>Relevant Assignments:</w:t>
+      </w:r>
+    </w:p>
+    <w:p>
+      <w:pPr>
+        <w:pStyle w:val="Footer"/>
+        <w:tabs>
+          <w:tab w:val="clear" w:pos="4320"/>
+          <w:tab w:val="clear" w:pos="8640"/>
+          <w:tab w:val="right" w:pos="9360"/>
+        </w:tabs>
+        <w:ind w:left="720"/>
+        <w:rPr>
+          <w:b/>
+          <w:bCs/>
+          <w:szCs w:val="22"/>
+        </w:rPr>
+      </w:pPr>
+    </w:p>
+    <w:p>
+      <w:pPr>
+        <w:ind w:left="720"/>
+        <w:rPr>
+          <w:sz w:val="22"/>
+          <w:szCs w:val="22"/>
+        </w:rPr>
+      </w:pPr>
+      <w:r>
+        <w:rPr>
+          <w:b/>
+          <w:bCs/>
+          <w:sz w:val="22"/>
+          <w:szCs w:val="22"/>
+        </w:rPr>
+        <w:t>Genetic Algorithm</w:t>
+      </w:r>
+      <w:r>
+        <w:rPr>
+          <w:b/>
+          <w:bCs/>
+          <w:sz w:val="22"/>
+          <w:szCs w:val="22"/>
+        </w:rPr>
+        <w:t xml:space="preserve">, </w:t>
+      </w:r>
+      <w:r>
+        <w:rPr>
+          <w:sz w:val="22"/>
+          <w:szCs w:val="22"/>
+        </w:rPr>
+        <w:t>Artificial Intelligence,</w:t>
+      </w:r>
+      <w:r>
+        <w:rPr>
+          <w:sz w:val="22"/>
+          <w:szCs w:val="22"/>
+        </w:rPr>
+        <w:t xml:space="preserve"> </w:t>
+      </w:r>
+      <w:r>
+        <w:rPr>
+          <w:sz w:val="22"/>
+          <w:szCs w:val="22"/>
+        </w:rPr>
+        <w:t>May – August 2011</w:t>
+      </w:r>
+    </w:p>
+    <w:p>
+      <w:pPr>
+        <w:ind w:left="720"/>
+        <w:rPr>
+          <w:sz w:val="22"/>
+          <w:szCs w:val="22"/>
+        </w:rPr>
+      </w:pPr>
+    </w:p>
+    <w:p>
+      <w:pPr>
+        <w:numPr>
+          <w:ilvl w:val="0"/>
+          <w:numId w:val="1"/>
+        </w:numPr>
         <w:tabs>
           <w:tab w:val="clear" w:pos="720"/>
           <w:tab w:val="num" w:pos="1440"/>
         </w:tabs>
         <w:ind w:left="1440"/>
         <w:rPr>
+          <w:sz w:val="22"/>
+          <w:szCs w:val="22"/>
+        </w:rPr>
+      </w:pPr>
+      <w:r>
+        <w:rPr>
+          <w:sz w:val="22"/>
+          <w:szCs w:val="22"/>
+          <w:lang w:val="en-US"/>
+        </w:rPr>
+        <w:t>Implemented</w:t>
+      </w:r>
+      <w:r>
+        <w:rPr>
+          <w:sz w:val="22"/>
+          <w:szCs w:val="22"/>
+          <w:lang w:val="en-US"/>
+        </w:rPr>
+        <w:t xml:space="preserve"> a solution to the Wordsnakes game</w:t>
+      </w:r>
+    </w:p>
+    <w:p>
+      <w:pPr>
+        <w:numPr>
+          <w:ilvl w:val="0"/>
+          <w:numId w:val="1"/>
+        </w:numPr>
+        <w:tabs>
+          <w:tab w:val="clear" w:pos="720"/>
+          <w:tab w:val="num" w:pos="1440"/>
+        </w:tabs>
+        <w:ind w:left="1440"/>
+        <w:rPr>
           <w:b/>
           <w:bCs/>
           <w:szCs w:val="22"/>
@@ -1947,7 +1944,41 @@
           <w:szCs w:val="22"/>
           <w:lang w:val="en-US"/>
         </w:rPr>
-        <w:t>Using a combination of graph-searching with heuristics and a genetic algorithm</w:t>
+        <w:t>Used</w:t>
+      </w:r>
+      <w:r>
+        <w:rPr>
+          <w:sz w:val="22"/>
+          <w:szCs w:val="22"/>
+          <w:lang w:val="en-US"/>
+        </w:rPr>
+        <w:t xml:space="preserve"> a combination of graph-searching with heuristics and a genetic algorithm</w:t>
+      </w:r>
+    </w:p>
+    <w:p>
+      <w:pPr>
+        <w:numPr>
+          <w:ilvl w:val="0"/>
+          <w:numId w:val="1"/>
+        </w:numPr>
+        <w:tabs>
+          <w:tab w:val="clear" w:pos="720"/>
+          <w:tab w:val="num" w:pos="1440"/>
+        </w:tabs>
+        <w:ind w:left="1440"/>
+        <w:rPr>
+          <w:b/>
+          <w:bCs/>
+          <w:szCs w:val="22"/>
+        </w:rPr>
+      </w:pPr>
+      <w:r>
+        <w:rPr>
+          <w:sz w:val="22"/>
+          <w:szCs w:val="22"/>
+          <w:lang w:val="en-US"/>
+        </w:rPr>
+        <w:t>Successfully organized a team of 3</w:t>
       </w:r>
     </w:p>
     <w:p>
@@ -3227,7 +3258,6 @@
   </w:style>
   <w:style w:type="character" w:default="1" w:styleId="DefaultParagraphFont">
     <w:name w:val="Default Paragraph Font"/>
-    <w:semiHidden/>
     <w:unhideWhenUsed/>
   </w:style>
   <w:style w:type="table" w:default="1" w:styleId="TableNormal">

</xml_diff>